<commit_message>
feat: add week 3-4 materials and update week 2 docx
</commit_message>
<xml_diff>
--- a/week_2/week-02-José-Martínez.docx
+++ b/week_2/week-02-José-Martínez.docx
@@ -327,21 +327,7 @@
           <w:rFonts w:ascii="Arial" w:hAnsi="Arial" w:cs="Arial"/>
           <w:lang w:val="en-US"/>
         </w:rPr>
-        <w:t>2</w:t>
-      </w:r>
-      <w:r>
-        <w:rPr>
-          <w:rFonts w:ascii="Arial" w:hAnsi="Arial" w:cs="Arial"/>
-          <w:lang w:val="en-US"/>
-        </w:rPr>
-        <w:t>6</w:t>
-      </w:r>
-      <w:r>
-        <w:rPr>
-          <w:rFonts w:ascii="Arial" w:hAnsi="Arial" w:cs="Arial"/>
-          <w:lang w:val="en-US"/>
-        </w:rPr>
-        <w:t xml:space="preserve"> de Agosto 2026</w:t>
+        <w:t>26 de Agosto 2026</w:t>
       </w:r>
     </w:p>
     <w:p>
@@ -383,6 +369,7 @@
       <w:r>
         <w:rPr>
           <w:rFonts w:ascii="Arial" w:hAnsi="Arial" w:cs="Arial"/>
+          <w:noProof/>
           <w:sz w:val="22"/>
           <w:szCs w:val="22"/>
           <w:lang w:val="en-US"/>
@@ -436,6 +423,7 @@
       <w:r>
         <w:rPr>
           <w:rFonts w:ascii="Arial" w:hAnsi="Arial" w:cs="Arial"/>
+          <w:noProof/>
           <w:sz w:val="22"/>
           <w:szCs w:val="22"/>
           <w:lang w:val="en-US"/>
@@ -506,6 +494,1870 @@
     <w:p>
       <w:pPr>
         <w:rPr>
+          <w:b/>
+          <w:bCs/>
+          <w:lang w:val="en-US"/>
+        </w:rPr>
+      </w:pPr>
+      <w:r>
+        <w:rPr>
+          <w:b/>
+          <w:bCs/>
+          <w:lang w:val="en-US"/>
+        </w:rPr>
+        <w:t>System prompt vs no system prompt</w:t>
+      </w:r>
+    </w:p>
+    <w:p>
+      <w:pPr>
+        <w:rPr>
+          <w:lang w:val="en-US"/>
+        </w:rPr>
+      </w:pPr>
+      <w:r>
+        <w:rPr>
+          <w:lang w:val="en-US"/>
+        </w:rPr>
+        <w:lastRenderedPageBreak/>
+        <w:drawing>
+          <wp:inline distT="0" distB="0" distL="0" distR="0" wp14:anchorId="5C7E441D" wp14:editId="6107F5E3">
+            <wp:extent cx="5612130" cy="5364480"/>
+            <wp:effectExtent l="0" t="0" r="7620" b="7620"/>
+            <wp:docPr id="762054843" name="Imagen 1"/>
+            <wp:cNvGraphicFramePr>
+              <a:graphicFrameLocks xmlns:a="http://schemas.openxmlformats.org/drawingml/2006/main" noChangeAspect="1"/>
+            </wp:cNvGraphicFramePr>
+            <a:graphic xmlns:a="http://schemas.openxmlformats.org/drawingml/2006/main">
+              <a:graphicData uri="http://schemas.openxmlformats.org/drawingml/2006/picture">
+                <pic:pic xmlns:pic="http://schemas.openxmlformats.org/drawingml/2006/picture">
+                  <pic:nvPicPr>
+                    <pic:cNvPr id="762054843" name=""/>
+                    <pic:cNvPicPr/>
+                  </pic:nvPicPr>
+                  <pic:blipFill>
+                    <a:blip r:embed="rId7"/>
+                    <a:stretch>
+                      <a:fillRect/>
+                    </a:stretch>
+                  </pic:blipFill>
+                  <pic:spPr>
+                    <a:xfrm>
+                      <a:off x="0" y="0"/>
+                      <a:ext cx="5612130" cy="5364480"/>
+                    </a:xfrm>
+                    <a:prstGeom prst="rect">
+                      <a:avLst/>
+                    </a:prstGeom>
+                  </pic:spPr>
+                </pic:pic>
+              </a:graphicData>
+            </a:graphic>
+          </wp:inline>
+        </w:drawing>
+      </w:r>
+    </w:p>
+    <w:p>
+      <w:pPr>
+        <w:rPr>
+          <w:rFonts w:ascii="Arial" w:hAnsi="Arial" w:cs="Arial"/>
+          <w:i/>
+          <w:iCs/>
+          <w:sz w:val="22"/>
+          <w:szCs w:val="22"/>
+          <w:lang w:val="en-US"/>
+        </w:rPr>
+      </w:pPr>
+      <w:r>
+        <w:rPr>
+          <w:rFonts w:ascii="Arial" w:hAnsi="Arial" w:cs="Arial"/>
+          <w:b/>
+          <w:bCs/>
+          <w:sz w:val="22"/>
+          <w:szCs w:val="22"/>
+          <w:lang w:val="en-US"/>
+        </w:rPr>
+        <w:t>LLM Answer:</w:t>
+      </w:r>
+      <w:r>
+        <w:rPr>
+          <w:rFonts w:ascii="Arial" w:hAnsi="Arial" w:cs="Arial"/>
+          <w:sz w:val="22"/>
+          <w:szCs w:val="22"/>
+          <w:lang w:val="en-US"/>
+        </w:rPr>
+        <w:br/>
+      </w:r>
+      <w:r>
+        <w:rPr>
+          <w:rFonts w:ascii="Arial" w:hAnsi="Arial" w:cs="Arial"/>
+          <w:i/>
+          <w:iCs/>
+          <w:sz w:val="22"/>
+          <w:szCs w:val="22"/>
+          <w:lang w:val="en-US"/>
+        </w:rPr>
+        <w:t>“</w:t>
+      </w:r>
+      <w:r>
+        <w:rPr>
+          <w:rFonts w:ascii="Arial" w:hAnsi="Arial" w:cs="Arial"/>
+          <w:i/>
+          <w:iCs/>
+          <w:sz w:val="22"/>
+          <w:szCs w:val="22"/>
+          <w:lang w:val="en-US"/>
+        </w:rPr>
+        <w:t xml:space="preserve">Direct use of automatic function calling (AFC) in </w:t>
+      </w:r>
+      <w:proofErr w:type="spellStart"/>
+      <w:r>
+        <w:rPr>
+          <w:rFonts w:ascii="Arial" w:hAnsi="Arial" w:cs="Arial"/>
+          <w:i/>
+          <w:iCs/>
+          <w:sz w:val="22"/>
+          <w:szCs w:val="22"/>
+          <w:lang w:val="en-US"/>
+        </w:rPr>
+        <w:t>Models.generate_content</w:t>
+      </w:r>
+      <w:proofErr w:type="spellEnd"/>
+      <w:r>
+        <w:rPr>
+          <w:rFonts w:ascii="Arial" w:hAnsi="Arial" w:cs="Arial"/>
+          <w:i/>
+          <w:iCs/>
+          <w:sz w:val="22"/>
+          <w:szCs w:val="22"/>
+          <w:lang w:val="en-US"/>
+        </w:rPr>
+        <w:t xml:space="preserve"> is not recommended. Instead, we recommend to use AFC in </w:t>
+      </w:r>
+      <w:proofErr w:type="spellStart"/>
+      <w:r>
+        <w:rPr>
+          <w:rFonts w:ascii="Arial" w:hAnsi="Arial" w:cs="Arial"/>
+          <w:i/>
+          <w:iCs/>
+          <w:sz w:val="22"/>
+          <w:szCs w:val="22"/>
+          <w:lang w:val="en-US"/>
+        </w:rPr>
+        <w:t>Chat.send_message</w:t>
+      </w:r>
+      <w:proofErr w:type="spellEnd"/>
+      <w:r>
+        <w:rPr>
+          <w:rFonts w:ascii="Arial" w:hAnsi="Arial" w:cs="Arial"/>
+          <w:i/>
+          <w:iCs/>
+          <w:sz w:val="22"/>
+          <w:szCs w:val="22"/>
+          <w:lang w:val="en-US"/>
+        </w:rPr>
+        <w:t xml:space="preserve">. Similarly, direct use of AFC in </w:t>
+      </w:r>
+      <w:proofErr w:type="spellStart"/>
+      <w:r>
+        <w:rPr>
+          <w:rFonts w:ascii="Arial" w:hAnsi="Arial" w:cs="Arial"/>
+          <w:i/>
+          <w:iCs/>
+          <w:sz w:val="22"/>
+          <w:szCs w:val="22"/>
+          <w:lang w:val="en-US"/>
+        </w:rPr>
+        <w:t>Models.generate_content_stream</w:t>
+      </w:r>
+      <w:proofErr w:type="spellEnd"/>
+      <w:r>
+        <w:rPr>
+          <w:rFonts w:ascii="Arial" w:hAnsi="Arial" w:cs="Arial"/>
+          <w:i/>
+          <w:iCs/>
+          <w:sz w:val="22"/>
+          <w:szCs w:val="22"/>
+          <w:lang w:val="en-US"/>
+        </w:rPr>
+        <w:t xml:space="preserve"> is not recommended. Instead, we recommend to use AFC in </w:t>
+      </w:r>
+      <w:proofErr w:type="spellStart"/>
+      <w:r>
+        <w:rPr>
+          <w:rFonts w:ascii="Arial" w:hAnsi="Arial" w:cs="Arial"/>
+          <w:i/>
+          <w:iCs/>
+          <w:sz w:val="22"/>
+          <w:szCs w:val="22"/>
+          <w:lang w:val="en-US"/>
+        </w:rPr>
+        <w:t>Chat.send_message_stream</w:t>
+      </w:r>
+      <w:proofErr w:type="spellEnd"/>
+      <w:r>
+        <w:rPr>
+          <w:rFonts w:ascii="Arial" w:hAnsi="Arial" w:cs="Arial"/>
+          <w:i/>
+          <w:iCs/>
+          <w:sz w:val="22"/>
+          <w:szCs w:val="22"/>
+          <w:lang w:val="en-US"/>
+        </w:rPr>
+        <w:t>.</w:t>
+      </w:r>
+    </w:p>
+    <w:p>
+      <w:pPr>
+        <w:rPr>
+          <w:rFonts w:ascii="Arial" w:hAnsi="Arial" w:cs="Arial"/>
+          <w:i/>
+          <w:iCs/>
+          <w:sz w:val="22"/>
+          <w:szCs w:val="22"/>
+          <w:lang w:val="en-US"/>
+        </w:rPr>
+      </w:pPr>
+      <w:r>
+        <w:rPr>
+          <w:rFonts w:ascii="Arial" w:hAnsi="Arial" w:cs="Arial"/>
+          <w:i/>
+          <w:iCs/>
+          <w:sz w:val="22"/>
+          <w:szCs w:val="22"/>
+          <w:lang w:val="en-US"/>
+        </w:rPr>
+        <w:t>--- Without system prompt ---</w:t>
+      </w:r>
+    </w:p>
+    <w:p>
+      <w:pPr>
+        <w:rPr>
+          <w:rFonts w:ascii="Arial" w:hAnsi="Arial" w:cs="Arial"/>
+          <w:i/>
+          <w:iCs/>
+          <w:sz w:val="22"/>
+          <w:szCs w:val="22"/>
+          <w:lang w:val="en-US"/>
+        </w:rPr>
+      </w:pPr>
+      <w:r>
+        <w:rPr>
+          <w:rFonts w:ascii="Arial" w:hAnsi="Arial" w:cs="Arial"/>
+          <w:i/>
+          <w:iCs/>
+          <w:sz w:val="22"/>
+          <w:szCs w:val="22"/>
+          <w:lang w:val="en-US"/>
+        </w:rPr>
+        <w:t>A loose front brake is usually caused by cable slack, worn pads, or air in the hydraulic line. Because your front brake provides about 70% of your stopping power, getting it dialed in is critical.</w:t>
+      </w:r>
+    </w:p>
+    <w:p>
+      <w:pPr>
+        <w:rPr>
+          <w:rFonts w:ascii="Arial" w:hAnsi="Arial" w:cs="Arial"/>
+          <w:i/>
+          <w:iCs/>
+          <w:sz w:val="22"/>
+          <w:szCs w:val="22"/>
+          <w:lang w:val="en-US"/>
+        </w:rPr>
+      </w:pPr>
+    </w:p>
+    <w:p>
+      <w:pPr>
+        <w:rPr>
+          <w:rFonts w:ascii="Arial" w:hAnsi="Arial" w:cs="Arial"/>
+          <w:i/>
+          <w:iCs/>
+          <w:sz w:val="22"/>
+          <w:szCs w:val="22"/>
+          <w:lang w:val="en-US"/>
+        </w:rPr>
+      </w:pPr>
+      <w:r>
+        <w:rPr>
+          <w:rFonts w:ascii="Arial" w:hAnsi="Arial" w:cs="Arial"/>
+          <w:i/>
+          <w:iCs/>
+          <w:sz w:val="22"/>
+          <w:szCs w:val="22"/>
+          <w:lang w:val="en-US"/>
+        </w:rPr>
+        <w:t>Here is a step-by-step checklist to diagnose and fix the issue, categorized by common causes:</w:t>
+      </w:r>
+    </w:p>
+    <w:p>
+      <w:pPr>
+        <w:rPr>
+          <w:rFonts w:ascii="Arial" w:hAnsi="Arial" w:cs="Arial"/>
+          <w:i/>
+          <w:iCs/>
+          <w:sz w:val="22"/>
+          <w:szCs w:val="22"/>
+          <w:lang w:val="en-US"/>
+        </w:rPr>
+      </w:pPr>
+    </w:p>
+    <w:p>
+      <w:pPr>
+        <w:rPr>
+          <w:rFonts w:ascii="Arial" w:hAnsi="Arial" w:cs="Arial"/>
+          <w:i/>
+          <w:iCs/>
+          <w:sz w:val="22"/>
+          <w:szCs w:val="22"/>
+          <w:lang w:val="en-US"/>
+        </w:rPr>
+      </w:pPr>
+      <w:r>
+        <w:rPr>
+          <w:rFonts w:ascii="Arial" w:hAnsi="Arial" w:cs="Arial"/>
+          <w:i/>
+          <w:iCs/>
+          <w:sz w:val="22"/>
+          <w:szCs w:val="22"/>
+          <w:lang w:val="en-US"/>
+        </w:rPr>
+        <w:t>---</w:t>
+      </w:r>
+    </w:p>
+    <w:p>
+      <w:pPr>
+        <w:rPr>
+          <w:rFonts w:ascii="Arial" w:hAnsi="Arial" w:cs="Arial"/>
+          <w:i/>
+          <w:iCs/>
+          <w:sz w:val="22"/>
+          <w:szCs w:val="22"/>
+          <w:lang w:val="en-US"/>
+        </w:rPr>
+      </w:pPr>
+    </w:p>
+    <w:p>
+      <w:pPr>
+        <w:rPr>
+          <w:rFonts w:ascii="Arial" w:hAnsi="Arial" w:cs="Arial"/>
+          <w:i/>
+          <w:iCs/>
+          <w:sz w:val="22"/>
+          <w:szCs w:val="22"/>
+          <w:lang w:val="en-US"/>
+        </w:rPr>
+      </w:pPr>
+      <w:r>
+        <w:rPr>
+          <w:rFonts w:ascii="Arial" w:hAnsi="Arial" w:cs="Arial"/>
+          <w:i/>
+          <w:iCs/>
+          <w:sz w:val="22"/>
+          <w:szCs w:val="22"/>
+          <w:lang w:val="en-US"/>
+        </w:rPr>
+        <w:t>### 1. The Quick Checks (Start Here)</w:t>
+      </w:r>
+    </w:p>
+    <w:p>
+      <w:pPr>
+        <w:rPr>
+          <w:rFonts w:ascii="Arial" w:hAnsi="Arial" w:cs="Arial"/>
+          <w:i/>
+          <w:iCs/>
+          <w:sz w:val="22"/>
+          <w:szCs w:val="22"/>
+          <w:lang w:val="en-US"/>
+        </w:rPr>
+      </w:pPr>
+      <w:r>
+        <w:rPr>
+          <w:rFonts w:ascii="Arial" w:hAnsi="Arial" w:cs="Arial"/>
+          <w:i/>
+          <w:iCs/>
+          <w:sz w:val="22"/>
+          <w:szCs w:val="22"/>
+          <w:lang w:val="en-US"/>
+        </w:rPr>
+        <w:t xml:space="preserve">* **Is the quick-release open?** </w:t>
+      </w:r>
+    </w:p>
+    <w:p>
+      <w:pPr>
+        <w:rPr>
+          <w:rFonts w:ascii="Arial" w:hAnsi="Arial" w:cs="Arial"/>
+          <w:i/>
+          <w:iCs/>
+          <w:sz w:val="22"/>
+          <w:szCs w:val="22"/>
+          <w:lang w:val="en-US"/>
+        </w:rPr>
+      </w:pPr>
+      <w:r>
+        <w:rPr>
+          <w:rFonts w:ascii="Arial" w:hAnsi="Arial" w:cs="Arial"/>
+          <w:i/>
+          <w:iCs/>
+          <w:sz w:val="22"/>
+          <w:szCs w:val="22"/>
+          <w:lang w:val="en-US"/>
+        </w:rPr>
+        <w:t xml:space="preserve">  * *Rim brakes:* There is often a small lever on the caliper or a noodle (on V-brakes) that you unhook to remove the wheel. If it’s open, the brake will feel completely slack.</w:t>
+      </w:r>
+    </w:p>
+    <w:p>
+      <w:pPr>
+        <w:rPr>
+          <w:rFonts w:ascii="Arial" w:hAnsi="Arial" w:cs="Arial"/>
+          <w:i/>
+          <w:iCs/>
+          <w:sz w:val="22"/>
+          <w:szCs w:val="22"/>
+          <w:lang w:val="en-US"/>
+        </w:rPr>
+      </w:pPr>
+      <w:r>
+        <w:rPr>
+          <w:rFonts w:ascii="Arial" w:hAnsi="Arial" w:cs="Arial"/>
+          <w:i/>
+          <w:iCs/>
+          <w:sz w:val="22"/>
+          <w:szCs w:val="22"/>
+          <w:lang w:val="en-US"/>
+        </w:rPr>
+        <w:t xml:space="preserve">  * *Disc brakes:* Ensure the wheel axle is seated properly in the fork dropouts.</w:t>
+      </w:r>
+    </w:p>
+    <w:p>
+      <w:pPr>
+        <w:rPr>
+          <w:rFonts w:ascii="Arial" w:hAnsi="Arial" w:cs="Arial"/>
+          <w:i/>
+          <w:iCs/>
+          <w:sz w:val="22"/>
+          <w:szCs w:val="22"/>
+          <w:lang w:val="en-US"/>
+        </w:rPr>
+      </w:pPr>
+      <w:r>
+        <w:rPr>
+          <w:rFonts w:ascii="Arial" w:hAnsi="Arial" w:cs="Arial"/>
+          <w:i/>
+          <w:iCs/>
+          <w:sz w:val="22"/>
+          <w:szCs w:val="22"/>
+          <w:lang w:val="en-US"/>
+        </w:rPr>
+        <w:t>* **Is the caliper or lever physically loose?**</w:t>
+      </w:r>
+    </w:p>
+    <w:p>
+      <w:pPr>
+        <w:rPr>
+          <w:rFonts w:ascii="Arial" w:hAnsi="Arial" w:cs="Arial"/>
+          <w:i/>
+          <w:iCs/>
+          <w:sz w:val="22"/>
+          <w:szCs w:val="22"/>
+          <w:lang w:val="en-US"/>
+        </w:rPr>
+      </w:pPr>
+      <w:r>
+        <w:rPr>
+          <w:rFonts w:ascii="Arial" w:hAnsi="Arial" w:cs="Arial"/>
+          <w:i/>
+          <w:iCs/>
+          <w:sz w:val="22"/>
+          <w:szCs w:val="22"/>
+          <w:lang w:val="en-US"/>
+        </w:rPr>
+        <w:t xml:space="preserve">  * Check the bolts holding the brake lever to the handlebar and the brake caliper to the fork. Tighten them if they wiggle.</w:t>
+      </w:r>
+    </w:p>
+    <w:p>
+      <w:pPr>
+        <w:rPr>
+          <w:rFonts w:ascii="Arial" w:hAnsi="Arial" w:cs="Arial"/>
+          <w:i/>
+          <w:iCs/>
+          <w:sz w:val="22"/>
+          <w:szCs w:val="22"/>
+          <w:lang w:val="en-US"/>
+        </w:rPr>
+      </w:pPr>
+    </w:p>
+    <w:p>
+      <w:pPr>
+        <w:rPr>
+          <w:rFonts w:ascii="Arial" w:hAnsi="Arial" w:cs="Arial"/>
+          <w:i/>
+          <w:iCs/>
+          <w:sz w:val="22"/>
+          <w:szCs w:val="22"/>
+          <w:lang w:val="en-US"/>
+        </w:rPr>
+      </w:pPr>
+      <w:r>
+        <w:rPr>
+          <w:rFonts w:ascii="Arial" w:hAnsi="Arial" w:cs="Arial"/>
+          <w:i/>
+          <w:iCs/>
+          <w:sz w:val="22"/>
+          <w:szCs w:val="22"/>
+          <w:lang w:val="en-US"/>
+        </w:rPr>
+        <w:t>---</w:t>
+      </w:r>
+    </w:p>
+    <w:p>
+      <w:pPr>
+        <w:rPr>
+          <w:rFonts w:ascii="Arial" w:hAnsi="Arial" w:cs="Arial"/>
+          <w:i/>
+          <w:iCs/>
+          <w:sz w:val="22"/>
+          <w:szCs w:val="22"/>
+          <w:lang w:val="en-US"/>
+        </w:rPr>
+      </w:pPr>
+    </w:p>
+    <w:p>
+      <w:pPr>
+        <w:rPr>
+          <w:rFonts w:ascii="Arial" w:hAnsi="Arial" w:cs="Arial"/>
+          <w:i/>
+          <w:iCs/>
+          <w:sz w:val="22"/>
+          <w:szCs w:val="22"/>
+          <w:lang w:val="en-US"/>
+        </w:rPr>
+      </w:pPr>
+      <w:r>
+        <w:rPr>
+          <w:rFonts w:ascii="Arial" w:hAnsi="Arial" w:cs="Arial"/>
+          <w:i/>
+          <w:iCs/>
+          <w:sz w:val="22"/>
+          <w:szCs w:val="22"/>
+          <w:lang w:val="en-US"/>
+        </w:rPr>
+        <w:t>### 2. If You Have Cable Brakes (Rim or Mechanical Disc)</w:t>
+      </w:r>
+    </w:p>
+    <w:p>
+      <w:pPr>
+        <w:rPr>
+          <w:rFonts w:ascii="Arial" w:hAnsi="Arial" w:cs="Arial"/>
+          <w:i/>
+          <w:iCs/>
+          <w:sz w:val="22"/>
+          <w:szCs w:val="22"/>
+          <w:lang w:val="en-US"/>
+        </w:rPr>
+      </w:pPr>
+    </w:p>
+    <w:p>
+      <w:pPr>
+        <w:rPr>
+          <w:rFonts w:ascii="Arial" w:hAnsi="Arial" w:cs="Arial"/>
+          <w:i/>
+          <w:iCs/>
+          <w:sz w:val="22"/>
+          <w:szCs w:val="22"/>
+          <w:lang w:val="en-US"/>
+        </w:rPr>
+      </w:pPr>
+      <w:r>
+        <w:rPr>
+          <w:rFonts w:ascii="Arial" w:hAnsi="Arial" w:cs="Arial"/>
+          <w:i/>
+          <w:iCs/>
+          <w:sz w:val="22"/>
+          <w:szCs w:val="22"/>
+          <w:lang w:val="en-US"/>
+        </w:rPr>
+        <w:t>If pulling the lever goes all the way to the handlebar, the cable has likely stretched, slipped, or the pads are worn.</w:t>
+      </w:r>
+    </w:p>
+    <w:p>
+      <w:pPr>
+        <w:rPr>
+          <w:rFonts w:ascii="Arial" w:hAnsi="Arial" w:cs="Arial"/>
+          <w:i/>
+          <w:iCs/>
+          <w:sz w:val="22"/>
+          <w:szCs w:val="22"/>
+          <w:lang w:val="en-US"/>
+        </w:rPr>
+      </w:pPr>
+    </w:p>
+    <w:p>
+      <w:pPr>
+        <w:rPr>
+          <w:rFonts w:ascii="Arial" w:hAnsi="Arial" w:cs="Arial"/>
+          <w:i/>
+          <w:iCs/>
+          <w:sz w:val="22"/>
+          <w:szCs w:val="22"/>
+          <w:lang w:val="en-US"/>
+        </w:rPr>
+      </w:pPr>
+      <w:r>
+        <w:rPr>
+          <w:rFonts w:ascii="Arial" w:hAnsi="Arial" w:cs="Arial"/>
+          <w:i/>
+          <w:iCs/>
+          <w:sz w:val="22"/>
+          <w:szCs w:val="22"/>
+          <w:lang w:val="en-US"/>
+        </w:rPr>
+        <w:t>* **Check the Barrel Adjuster:**</w:t>
+      </w:r>
+    </w:p>
+    <w:p>
+      <w:pPr>
+        <w:rPr>
+          <w:rFonts w:ascii="Arial" w:hAnsi="Arial" w:cs="Arial"/>
+          <w:i/>
+          <w:iCs/>
+          <w:sz w:val="22"/>
+          <w:szCs w:val="22"/>
+          <w:lang w:val="en-US"/>
+        </w:rPr>
+      </w:pPr>
+      <w:r>
+        <w:rPr>
+          <w:rFonts w:ascii="Arial" w:hAnsi="Arial" w:cs="Arial"/>
+          <w:i/>
+          <w:iCs/>
+          <w:sz w:val="22"/>
+          <w:szCs w:val="22"/>
+          <w:lang w:val="en-US"/>
+        </w:rPr>
+        <w:t xml:space="preserve">  * Locate the small threaded barrel where the cable enters the brake lever (or caliper).</w:t>
+      </w:r>
+    </w:p>
+    <w:p>
+      <w:pPr>
+        <w:rPr>
+          <w:rFonts w:ascii="Arial" w:hAnsi="Arial" w:cs="Arial"/>
+          <w:i/>
+          <w:iCs/>
+          <w:sz w:val="22"/>
+          <w:szCs w:val="22"/>
+          <w:lang w:val="en-US"/>
+        </w:rPr>
+      </w:pPr>
+      <w:r>
+        <w:rPr>
+          <w:rFonts w:ascii="Arial" w:hAnsi="Arial" w:cs="Arial"/>
+          <w:i/>
+          <w:iCs/>
+          <w:sz w:val="22"/>
+          <w:szCs w:val="22"/>
+          <w:lang w:val="en-US"/>
+        </w:rPr>
+        <w:t xml:space="preserve">  * Unscrew it counterclockwise a few turns. This extends the housing and tightens the cable.</w:t>
+      </w:r>
+    </w:p>
+    <w:p>
+      <w:pPr>
+        <w:rPr>
+          <w:rFonts w:ascii="Arial" w:hAnsi="Arial" w:cs="Arial"/>
+          <w:i/>
+          <w:iCs/>
+          <w:sz w:val="22"/>
+          <w:szCs w:val="22"/>
+          <w:lang w:val="en-US"/>
+        </w:rPr>
+      </w:pPr>
+      <w:r>
+        <w:rPr>
+          <w:rFonts w:ascii="Arial" w:hAnsi="Arial" w:cs="Arial"/>
+          <w:i/>
+          <w:iCs/>
+          <w:sz w:val="22"/>
+          <w:szCs w:val="22"/>
+          <w:lang w:val="en-US"/>
+        </w:rPr>
+        <w:t xml:space="preserve">  * If this fixes it, tighten the locking ring against the lever body to hold it in place.</w:t>
+      </w:r>
+    </w:p>
+    <w:p>
+      <w:pPr>
+        <w:rPr>
+          <w:rFonts w:ascii="Arial" w:hAnsi="Arial" w:cs="Arial"/>
+          <w:i/>
+          <w:iCs/>
+          <w:sz w:val="22"/>
+          <w:szCs w:val="22"/>
+          <w:lang w:val="en-US"/>
+        </w:rPr>
+      </w:pPr>
+      <w:r>
+        <w:rPr>
+          <w:rFonts w:ascii="Arial" w:hAnsi="Arial" w:cs="Arial"/>
+          <w:i/>
+          <w:iCs/>
+          <w:sz w:val="22"/>
+          <w:szCs w:val="22"/>
+          <w:lang w:val="en-US"/>
+        </w:rPr>
+        <w:t>* **Check the Brake Pads:**</w:t>
+      </w:r>
+    </w:p>
+    <w:p>
+      <w:pPr>
+        <w:rPr>
+          <w:rFonts w:ascii="Arial" w:hAnsi="Arial" w:cs="Arial"/>
+          <w:i/>
+          <w:iCs/>
+          <w:sz w:val="22"/>
+          <w:szCs w:val="22"/>
+          <w:lang w:val="en-US"/>
+        </w:rPr>
+      </w:pPr>
+      <w:r>
+        <w:rPr>
+          <w:rFonts w:ascii="Arial" w:hAnsi="Arial" w:cs="Arial"/>
+          <w:i/>
+          <w:iCs/>
+          <w:sz w:val="22"/>
+          <w:szCs w:val="22"/>
+          <w:lang w:val="en-US"/>
+        </w:rPr>
+        <w:t xml:space="preserve">  * Look at the pads. If the grooves are gone or they are thinner than 1–2 mm, they need to be replaced. Worn pads create a large gap, making the brake feel loose.</w:t>
+      </w:r>
+    </w:p>
+    <w:p>
+      <w:pPr>
+        <w:rPr>
+          <w:rFonts w:ascii="Arial" w:hAnsi="Arial" w:cs="Arial"/>
+          <w:i/>
+          <w:iCs/>
+          <w:sz w:val="22"/>
+          <w:szCs w:val="22"/>
+          <w:lang w:val="en-US"/>
+        </w:rPr>
+      </w:pPr>
+      <w:r>
+        <w:rPr>
+          <w:rFonts w:ascii="Arial" w:hAnsi="Arial" w:cs="Arial"/>
+          <w:i/>
+          <w:iCs/>
+          <w:sz w:val="22"/>
+          <w:szCs w:val="22"/>
+          <w:lang w:val="en-US"/>
+        </w:rPr>
+        <w:t>* **Tighten the Cable (Pinch Bolt):**</w:t>
+      </w:r>
+    </w:p>
+    <w:p>
+      <w:pPr>
+        <w:rPr>
+          <w:rFonts w:ascii="Arial" w:hAnsi="Arial" w:cs="Arial"/>
+          <w:i/>
+          <w:iCs/>
+          <w:sz w:val="22"/>
+          <w:szCs w:val="22"/>
+          <w:lang w:val="en-US"/>
+        </w:rPr>
+      </w:pPr>
+      <w:r>
+        <w:rPr>
+          <w:rFonts w:ascii="Arial" w:hAnsi="Arial" w:cs="Arial"/>
+          <w:i/>
+          <w:iCs/>
+          <w:sz w:val="22"/>
+          <w:szCs w:val="22"/>
+          <w:lang w:val="en-US"/>
+        </w:rPr>
+        <w:t xml:space="preserve">  * If the barrel adjuster isn't enough:</w:t>
+      </w:r>
+    </w:p>
+    <w:p>
+      <w:pPr>
+        <w:rPr>
+          <w:rFonts w:ascii="Arial" w:hAnsi="Arial" w:cs="Arial"/>
+          <w:i/>
+          <w:iCs/>
+          <w:sz w:val="22"/>
+          <w:szCs w:val="22"/>
+          <w:lang w:val="en-US"/>
+        </w:rPr>
+      </w:pPr>
+      <w:r>
+        <w:rPr>
+          <w:rFonts w:ascii="Arial" w:hAnsi="Arial" w:cs="Arial"/>
+          <w:i/>
+          <w:iCs/>
+          <w:sz w:val="22"/>
+          <w:szCs w:val="22"/>
+          <w:lang w:val="en-US"/>
+        </w:rPr>
+        <w:t xml:space="preserve">    1. Screw the barrel adjuster almost all the way back in.</w:t>
+      </w:r>
+    </w:p>
+    <w:p>
+      <w:pPr>
+        <w:rPr>
+          <w:rFonts w:ascii="Arial" w:hAnsi="Arial" w:cs="Arial"/>
+          <w:i/>
+          <w:iCs/>
+          <w:sz w:val="22"/>
+          <w:szCs w:val="22"/>
+          <w:lang w:val="en-US"/>
+        </w:rPr>
+      </w:pPr>
+      <w:r>
+        <w:rPr>
+          <w:rFonts w:ascii="Arial" w:hAnsi="Arial" w:cs="Arial"/>
+          <w:i/>
+          <w:iCs/>
+          <w:sz w:val="22"/>
+          <w:szCs w:val="22"/>
+          <w:lang w:val="en-US"/>
+        </w:rPr>
+        <w:lastRenderedPageBreak/>
+        <w:t xml:space="preserve">    2. Loosen the cable pinch bolt on the brake caliper.</w:t>
+      </w:r>
+    </w:p>
+    <w:p>
+      <w:pPr>
+        <w:rPr>
+          <w:rFonts w:ascii="Arial" w:hAnsi="Arial" w:cs="Arial"/>
+          <w:i/>
+          <w:iCs/>
+          <w:sz w:val="22"/>
+          <w:szCs w:val="22"/>
+          <w:lang w:val="en-US"/>
+        </w:rPr>
+      </w:pPr>
+      <w:r>
+        <w:rPr>
+          <w:rFonts w:ascii="Arial" w:hAnsi="Arial" w:cs="Arial"/>
+          <w:i/>
+          <w:iCs/>
+          <w:sz w:val="22"/>
+          <w:szCs w:val="22"/>
+          <w:lang w:val="en-US"/>
+        </w:rPr>
+        <w:t xml:space="preserve">    3. Pull the cable taut with pliers while pushing the brake arms slightly closed.</w:t>
+      </w:r>
+    </w:p>
+    <w:p>
+      <w:pPr>
+        <w:rPr>
+          <w:rFonts w:ascii="Arial" w:hAnsi="Arial" w:cs="Arial"/>
+          <w:i/>
+          <w:iCs/>
+          <w:sz w:val="22"/>
+          <w:szCs w:val="22"/>
+          <w:lang w:val="en-US"/>
+        </w:rPr>
+      </w:pPr>
+      <w:r>
+        <w:rPr>
+          <w:rFonts w:ascii="Arial" w:hAnsi="Arial" w:cs="Arial"/>
+          <w:i/>
+          <w:iCs/>
+          <w:sz w:val="22"/>
+          <w:szCs w:val="22"/>
+          <w:lang w:val="en-US"/>
+        </w:rPr>
+        <w:t xml:space="preserve">    4. Retighten the bolt securely and test the lever.</w:t>
+      </w:r>
+    </w:p>
+    <w:p>
+      <w:pPr>
+        <w:rPr>
+          <w:rFonts w:ascii="Arial" w:hAnsi="Arial" w:cs="Arial"/>
+          <w:i/>
+          <w:iCs/>
+          <w:sz w:val="22"/>
+          <w:szCs w:val="22"/>
+          <w:lang w:val="en-US"/>
+        </w:rPr>
+      </w:pPr>
+      <w:r>
+        <w:rPr>
+          <w:rFonts w:ascii="Arial" w:hAnsi="Arial" w:cs="Arial"/>
+          <w:i/>
+          <w:iCs/>
+          <w:sz w:val="22"/>
+          <w:szCs w:val="22"/>
+          <w:lang w:val="en-US"/>
+        </w:rPr>
+        <w:t>* **Inspect the Cable and Housing:**</w:t>
+      </w:r>
+    </w:p>
+    <w:p>
+      <w:pPr>
+        <w:rPr>
+          <w:rFonts w:ascii="Arial" w:hAnsi="Arial" w:cs="Arial"/>
+          <w:i/>
+          <w:iCs/>
+          <w:sz w:val="22"/>
+          <w:szCs w:val="22"/>
+          <w:lang w:val="en-US"/>
+        </w:rPr>
+      </w:pPr>
+      <w:r>
+        <w:rPr>
+          <w:rFonts w:ascii="Arial" w:hAnsi="Arial" w:cs="Arial"/>
+          <w:i/>
+          <w:iCs/>
+          <w:sz w:val="22"/>
+          <w:szCs w:val="22"/>
+          <w:lang w:val="en-US"/>
+        </w:rPr>
+        <w:t xml:space="preserve">  * Check for fraying, rust, or kinks. Make sure the black cable housing is seated firmly inside the stops on the frame and lever.</w:t>
+      </w:r>
+    </w:p>
+    <w:p>
+      <w:pPr>
+        <w:rPr>
+          <w:rFonts w:ascii="Arial" w:hAnsi="Arial" w:cs="Arial"/>
+          <w:i/>
+          <w:iCs/>
+          <w:sz w:val="22"/>
+          <w:szCs w:val="22"/>
+          <w:lang w:val="en-US"/>
+        </w:rPr>
+      </w:pPr>
+    </w:p>
+    <w:p>
+      <w:pPr>
+        <w:rPr>
+          <w:rFonts w:ascii="Arial" w:hAnsi="Arial" w:cs="Arial"/>
+          <w:i/>
+          <w:iCs/>
+          <w:sz w:val="22"/>
+          <w:szCs w:val="22"/>
+          <w:lang w:val="en-US"/>
+        </w:rPr>
+      </w:pPr>
+      <w:r>
+        <w:rPr>
+          <w:rFonts w:ascii="Arial" w:hAnsi="Arial" w:cs="Arial"/>
+          <w:i/>
+          <w:iCs/>
+          <w:sz w:val="22"/>
+          <w:szCs w:val="22"/>
+          <w:lang w:val="en-US"/>
+        </w:rPr>
+        <w:t>---</w:t>
+      </w:r>
+    </w:p>
+    <w:p>
+      <w:pPr>
+        <w:rPr>
+          <w:rFonts w:ascii="Arial" w:hAnsi="Arial" w:cs="Arial"/>
+          <w:i/>
+          <w:iCs/>
+          <w:sz w:val="22"/>
+          <w:szCs w:val="22"/>
+          <w:lang w:val="en-US"/>
+        </w:rPr>
+      </w:pPr>
+    </w:p>
+    <w:p>
+      <w:pPr>
+        <w:rPr>
+          <w:rFonts w:ascii="Arial" w:hAnsi="Arial" w:cs="Arial"/>
+          <w:i/>
+          <w:iCs/>
+          <w:sz w:val="22"/>
+          <w:szCs w:val="22"/>
+          <w:lang w:val="en-US"/>
+        </w:rPr>
+      </w:pPr>
+      <w:r>
+        <w:rPr>
+          <w:rFonts w:ascii="Arial" w:hAnsi="Arial" w:cs="Arial"/>
+          <w:i/>
+          <w:iCs/>
+          <w:sz w:val="22"/>
+          <w:szCs w:val="22"/>
+          <w:lang w:val="en-US"/>
+        </w:rPr>
+        <w:t>### 3. If You Have Hydraulic Disc Brakes</w:t>
+      </w:r>
+    </w:p>
+    <w:p>
+      <w:pPr>
+        <w:rPr>
+          <w:rFonts w:ascii="Arial" w:hAnsi="Arial" w:cs="Arial"/>
+          <w:i/>
+          <w:iCs/>
+          <w:sz w:val="22"/>
+          <w:szCs w:val="22"/>
+          <w:lang w:val="en-US"/>
+        </w:rPr>
+      </w:pPr>
+    </w:p>
+    <w:p>
+      <w:pPr>
+        <w:rPr>
+          <w:rFonts w:ascii="Arial" w:hAnsi="Arial" w:cs="Arial"/>
+          <w:i/>
+          <w:iCs/>
+          <w:sz w:val="22"/>
+          <w:szCs w:val="22"/>
+          <w:lang w:val="en-US"/>
+        </w:rPr>
+      </w:pPr>
+      <w:r>
+        <w:rPr>
+          <w:rFonts w:ascii="Arial" w:hAnsi="Arial" w:cs="Arial"/>
+          <w:i/>
+          <w:iCs/>
+          <w:sz w:val="22"/>
+          <w:szCs w:val="22"/>
+          <w:lang w:val="en-US"/>
+        </w:rPr>
+        <w:t>If your brake lever feels "spongy" and pulls all the way to the grip without much resistance, cable adjustments won't apply.</w:t>
+      </w:r>
+    </w:p>
+    <w:p>
+      <w:pPr>
+        <w:rPr>
+          <w:rFonts w:ascii="Arial" w:hAnsi="Arial" w:cs="Arial"/>
+          <w:i/>
+          <w:iCs/>
+          <w:sz w:val="22"/>
+          <w:szCs w:val="22"/>
+          <w:lang w:val="en-US"/>
+        </w:rPr>
+      </w:pPr>
+    </w:p>
+    <w:p>
+      <w:pPr>
+        <w:rPr>
+          <w:rFonts w:ascii="Arial" w:hAnsi="Arial" w:cs="Arial"/>
+          <w:i/>
+          <w:iCs/>
+          <w:sz w:val="22"/>
+          <w:szCs w:val="22"/>
+          <w:lang w:val="en-US"/>
+        </w:rPr>
+      </w:pPr>
+      <w:r>
+        <w:rPr>
+          <w:rFonts w:ascii="Arial" w:hAnsi="Arial" w:cs="Arial"/>
+          <w:i/>
+          <w:iCs/>
+          <w:sz w:val="22"/>
+          <w:szCs w:val="22"/>
+          <w:lang w:val="en-US"/>
+        </w:rPr>
+        <w:t>* **Air in the Brake Lines:**</w:t>
+      </w:r>
+    </w:p>
+    <w:p>
+      <w:pPr>
+        <w:rPr>
+          <w:rFonts w:ascii="Arial" w:hAnsi="Arial" w:cs="Arial"/>
+          <w:i/>
+          <w:iCs/>
+          <w:sz w:val="22"/>
+          <w:szCs w:val="22"/>
+          <w:lang w:val="en-US"/>
+        </w:rPr>
+      </w:pPr>
+      <w:r>
+        <w:rPr>
+          <w:rFonts w:ascii="Arial" w:hAnsi="Arial" w:cs="Arial"/>
+          <w:i/>
+          <w:iCs/>
+          <w:sz w:val="22"/>
+          <w:szCs w:val="22"/>
+          <w:lang w:val="en-US"/>
+        </w:rPr>
+        <w:t xml:space="preserve">  * This is the most common issue. Hydraulic systems are closed; if air gets inside, the lever will feel soft/loose.</w:t>
+      </w:r>
+    </w:p>
+    <w:p>
+      <w:pPr>
+        <w:rPr>
+          <w:rFonts w:ascii="Arial" w:hAnsi="Arial" w:cs="Arial"/>
+          <w:i/>
+          <w:iCs/>
+          <w:sz w:val="22"/>
+          <w:szCs w:val="22"/>
+          <w:lang w:val="en-US"/>
+        </w:rPr>
+      </w:pPr>
+      <w:r>
+        <w:rPr>
+          <w:rFonts w:ascii="Arial" w:hAnsi="Arial" w:cs="Arial"/>
+          <w:i/>
+          <w:iCs/>
+          <w:sz w:val="22"/>
+          <w:szCs w:val="22"/>
+          <w:lang w:val="en-US"/>
+        </w:rPr>
+        <w:t xml:space="preserve">  * **Fix:** The brake needs to be **bled** (flushing old fluid and removing air bubbles). This requires a specific bleed kit and brake fluid (mineral oil or DOT fluid, depending on the brand).</w:t>
+      </w:r>
+    </w:p>
+    <w:p>
+      <w:pPr>
+        <w:rPr>
+          <w:rFonts w:ascii="Arial" w:hAnsi="Arial" w:cs="Arial"/>
+          <w:i/>
+          <w:iCs/>
+          <w:sz w:val="22"/>
+          <w:szCs w:val="22"/>
+          <w:lang w:val="en-US"/>
+        </w:rPr>
+      </w:pPr>
+      <w:r>
+        <w:rPr>
+          <w:rFonts w:ascii="Arial" w:hAnsi="Arial" w:cs="Arial"/>
+          <w:i/>
+          <w:iCs/>
+          <w:sz w:val="22"/>
+          <w:szCs w:val="22"/>
+          <w:lang w:val="en-US"/>
+        </w:rPr>
+        <w:t>* **Piston Retraction / Worn Pads:**</w:t>
+      </w:r>
+    </w:p>
+    <w:p>
+      <w:pPr>
+        <w:rPr>
+          <w:rFonts w:ascii="Arial" w:hAnsi="Arial" w:cs="Arial"/>
+          <w:i/>
+          <w:iCs/>
+          <w:sz w:val="22"/>
+          <w:szCs w:val="22"/>
+          <w:lang w:val="en-US"/>
+        </w:rPr>
+      </w:pPr>
+      <w:r>
+        <w:rPr>
+          <w:rFonts w:ascii="Arial" w:hAnsi="Arial" w:cs="Arial"/>
+          <w:i/>
+          <w:iCs/>
+          <w:sz w:val="22"/>
+          <w:szCs w:val="22"/>
+          <w:lang w:val="en-US"/>
+        </w:rPr>
+        <w:t xml:space="preserve">  * If the pads are worn thin, the pistons have to travel farther. Inspect the pad thickness.</w:t>
+      </w:r>
+    </w:p>
+    <w:p>
+      <w:pPr>
+        <w:rPr>
+          <w:rFonts w:ascii="Arial" w:hAnsi="Arial" w:cs="Arial"/>
+          <w:i/>
+          <w:iCs/>
+          <w:sz w:val="22"/>
+          <w:szCs w:val="22"/>
+          <w:lang w:val="en-US"/>
+        </w:rPr>
+      </w:pPr>
+      <w:r>
+        <w:rPr>
+          <w:rFonts w:ascii="Arial" w:hAnsi="Arial" w:cs="Arial"/>
+          <w:i/>
+          <w:iCs/>
+          <w:sz w:val="22"/>
+          <w:szCs w:val="22"/>
+          <w:lang w:val="en-US"/>
+        </w:rPr>
+        <w:t>* **Fluid Leaks:**</w:t>
+      </w:r>
+    </w:p>
+    <w:p>
+      <w:pPr>
+        <w:rPr>
+          <w:rFonts w:ascii="Arial" w:hAnsi="Arial" w:cs="Arial"/>
+          <w:i/>
+          <w:iCs/>
+          <w:sz w:val="22"/>
+          <w:szCs w:val="22"/>
+          <w:lang w:val="en-US"/>
+        </w:rPr>
+      </w:pPr>
+      <w:r>
+        <w:rPr>
+          <w:rFonts w:ascii="Arial" w:hAnsi="Arial" w:cs="Arial"/>
+          <w:i/>
+          <w:iCs/>
+          <w:sz w:val="22"/>
+          <w:szCs w:val="22"/>
+          <w:lang w:val="en-US"/>
+        </w:rPr>
+        <w:t xml:space="preserve">  * Check the lever, hose connections, and caliper for any oily residue. If fluid is leaking, the brake will lose pressure and contaminate the pads.</w:t>
+      </w:r>
+    </w:p>
+    <w:p>
+      <w:pPr>
+        <w:rPr>
+          <w:rFonts w:ascii="Arial" w:hAnsi="Arial" w:cs="Arial"/>
+          <w:i/>
+          <w:iCs/>
+          <w:sz w:val="22"/>
+          <w:szCs w:val="22"/>
+          <w:lang w:val="en-US"/>
+        </w:rPr>
+      </w:pPr>
+    </w:p>
+    <w:p>
+      <w:pPr>
+        <w:rPr>
+          <w:rFonts w:ascii="Arial" w:hAnsi="Arial" w:cs="Arial"/>
+          <w:i/>
+          <w:iCs/>
+          <w:sz w:val="22"/>
+          <w:szCs w:val="22"/>
+          <w:lang w:val="en-US"/>
+        </w:rPr>
+      </w:pPr>
+      <w:r>
+        <w:rPr>
+          <w:rFonts w:ascii="Arial" w:hAnsi="Arial" w:cs="Arial"/>
+          <w:i/>
+          <w:iCs/>
+          <w:sz w:val="22"/>
+          <w:szCs w:val="22"/>
+          <w:lang w:val="en-US"/>
+        </w:rPr>
+        <w:t>---</w:t>
+      </w:r>
+    </w:p>
+    <w:p>
+      <w:pPr>
+        <w:rPr>
+          <w:rFonts w:ascii="Arial" w:hAnsi="Arial" w:cs="Arial"/>
+          <w:i/>
+          <w:iCs/>
+          <w:sz w:val="22"/>
+          <w:szCs w:val="22"/>
+          <w:lang w:val="en-US"/>
+        </w:rPr>
+      </w:pPr>
+    </w:p>
+    <w:p>
+      <w:pPr>
+        <w:rPr>
+          <w:rFonts w:ascii="Arial" w:hAnsi="Arial" w:cs="Arial"/>
+          <w:i/>
+          <w:iCs/>
+          <w:sz w:val="22"/>
+          <w:szCs w:val="22"/>
+          <w:lang w:val="en-US"/>
+        </w:rPr>
+      </w:pPr>
+      <w:r>
+        <w:rPr>
+          <w:rFonts w:ascii="Arial" w:hAnsi="Arial" w:cs="Arial"/>
+          <w:i/>
+          <w:iCs/>
+          <w:sz w:val="22"/>
+          <w:szCs w:val="22"/>
+          <w:lang w:val="en-US"/>
+        </w:rPr>
+        <w:t>### Summary Checklist:</w:t>
+      </w:r>
+    </w:p>
+    <w:p>
+      <w:pPr>
+        <w:rPr>
+          <w:rFonts w:ascii="Arial" w:hAnsi="Arial" w:cs="Arial"/>
+          <w:i/>
+          <w:iCs/>
+          <w:sz w:val="22"/>
+          <w:szCs w:val="22"/>
+          <w:lang w:val="en-US"/>
+        </w:rPr>
+      </w:pPr>
+      <w:r>
+        <w:rPr>
+          <w:rFonts w:ascii="Arial" w:hAnsi="Arial" w:cs="Arial"/>
+          <w:i/>
+          <w:iCs/>
+          <w:sz w:val="22"/>
+          <w:szCs w:val="22"/>
+          <w:lang w:val="en-US"/>
+        </w:rPr>
+        <w:t>1. **Pads:** Are they worn out?</w:t>
+      </w:r>
+    </w:p>
+    <w:p>
+      <w:pPr>
+        <w:rPr>
+          <w:rFonts w:ascii="Arial" w:hAnsi="Arial" w:cs="Arial"/>
+          <w:i/>
+          <w:iCs/>
+          <w:sz w:val="22"/>
+          <w:szCs w:val="22"/>
+          <w:lang w:val="en-US"/>
+        </w:rPr>
+      </w:pPr>
+      <w:r>
+        <w:rPr>
+          <w:rFonts w:ascii="Arial" w:hAnsi="Arial" w:cs="Arial"/>
+          <w:i/>
+          <w:iCs/>
+          <w:sz w:val="22"/>
+          <w:szCs w:val="22"/>
+          <w:lang w:val="en-US"/>
+        </w:rPr>
+        <w:t>2. **Cable:** Is it loose, slipped, or disconnected? *(Cable brakes)*</w:t>
+      </w:r>
+    </w:p>
+    <w:p>
+      <w:pPr>
+        <w:rPr>
+          <w:rFonts w:ascii="Arial" w:hAnsi="Arial" w:cs="Arial"/>
+          <w:i/>
+          <w:iCs/>
+          <w:sz w:val="22"/>
+          <w:szCs w:val="22"/>
+          <w:lang w:val="en-US"/>
+        </w:rPr>
+      </w:pPr>
+      <w:r>
+        <w:rPr>
+          <w:rFonts w:ascii="Arial" w:hAnsi="Arial" w:cs="Arial"/>
+          <w:i/>
+          <w:iCs/>
+          <w:sz w:val="22"/>
+          <w:szCs w:val="22"/>
+          <w:lang w:val="en-US"/>
+        </w:rPr>
+        <w:lastRenderedPageBreak/>
+        <w:t>3. **Barrel Adjuster:** Can you take up the slack by turning it out? *(Cable brakes)*</w:t>
+      </w:r>
+    </w:p>
+    <w:p>
+      <w:pPr>
+        <w:rPr>
+          <w:rFonts w:ascii="Arial" w:hAnsi="Arial" w:cs="Arial"/>
+          <w:i/>
+          <w:iCs/>
+          <w:sz w:val="22"/>
+          <w:szCs w:val="22"/>
+          <w:lang w:val="en-US"/>
+        </w:rPr>
+      </w:pPr>
+      <w:r>
+        <w:rPr>
+          <w:rFonts w:ascii="Arial" w:hAnsi="Arial" w:cs="Arial"/>
+          <w:i/>
+          <w:iCs/>
+          <w:sz w:val="22"/>
+          <w:szCs w:val="22"/>
+          <w:lang w:val="en-US"/>
+        </w:rPr>
+        <w:t>4. **Air/Fluid:** Does the system need a bleed or have a leak? *(Hydraulic brakes)*</w:t>
+      </w:r>
+    </w:p>
+    <w:p>
+      <w:pPr>
+        <w:rPr>
+          <w:rFonts w:ascii="Arial" w:hAnsi="Arial" w:cs="Arial"/>
+          <w:i/>
+          <w:iCs/>
+          <w:sz w:val="22"/>
+          <w:szCs w:val="22"/>
+          <w:lang w:val="en-US"/>
+        </w:rPr>
+      </w:pPr>
+    </w:p>
+    <w:p>
+      <w:pPr>
+        <w:rPr>
+          <w:rFonts w:ascii="Arial" w:hAnsi="Arial" w:cs="Arial"/>
+          <w:i/>
+          <w:iCs/>
+          <w:sz w:val="22"/>
+          <w:szCs w:val="22"/>
+          <w:lang w:val="en-US"/>
+        </w:rPr>
+      </w:pPr>
+      <w:r>
+        <w:rPr>
+          <w:rFonts w:ascii="Arial" w:hAnsi="Arial" w:cs="Arial"/>
+          <w:i/>
+          <w:iCs/>
+          <w:sz w:val="22"/>
+          <w:szCs w:val="22"/>
+          <w:lang w:val="en-US"/>
+        </w:rPr>
+        <w:t>*Safety Note:* If you adjust the brake and it still doesn't stop the wheel with authority before the lever hits the handlebar, take it to your local bike shop before riding.</w:t>
+      </w:r>
+    </w:p>
+    <w:p>
+      <w:pPr>
+        <w:rPr>
+          <w:rFonts w:ascii="Arial" w:hAnsi="Arial" w:cs="Arial"/>
+          <w:i/>
+          <w:iCs/>
+          <w:sz w:val="22"/>
+          <w:szCs w:val="22"/>
+          <w:lang w:val="en-US"/>
+        </w:rPr>
+      </w:pPr>
+    </w:p>
+    <w:p>
+      <w:pPr>
+        <w:rPr>
+          <w:rFonts w:ascii="Arial" w:hAnsi="Arial" w:cs="Arial"/>
+          <w:i/>
+          <w:iCs/>
+          <w:sz w:val="22"/>
+          <w:szCs w:val="22"/>
+          <w:lang w:val="en-US"/>
+        </w:rPr>
+      </w:pPr>
+      <w:r>
+        <w:rPr>
+          <w:rFonts w:ascii="Arial" w:hAnsi="Arial" w:cs="Arial"/>
+          <w:i/>
+          <w:iCs/>
+          <w:sz w:val="22"/>
+          <w:szCs w:val="22"/>
+          <w:lang w:val="en-US"/>
+        </w:rPr>
+        <w:t>--- With system prompt ---</w:t>
+      </w:r>
+    </w:p>
+    <w:p>
+      <w:pPr>
+        <w:rPr>
+          <w:rFonts w:ascii="Arial" w:hAnsi="Arial" w:cs="Arial"/>
+          <w:i/>
+          <w:iCs/>
+          <w:sz w:val="22"/>
+          <w:szCs w:val="22"/>
+          <w:lang w:val="en-US"/>
+        </w:rPr>
+      </w:pPr>
+      <w:r>
+        <w:rPr>
+          <w:rFonts w:ascii="Arial" w:hAnsi="Arial" w:cs="Arial"/>
+          <w:i/>
+          <w:iCs/>
+          <w:sz w:val="22"/>
+          <w:szCs w:val="22"/>
+          <w:lang w:val="en-US"/>
+        </w:rPr>
+        <w:t>Check the barrel adjuster on your brake lever and turn it counterclockwise to increase cable tension. Also, inspect the brake cable at the wheel to ensure it hasn't slipped, and verify that the brake pads aren't overly worn. If it still feels unsafe, please bring the bike to one of our rental stations for immediate service</w:t>
+      </w:r>
+      <w:r>
+        <w:rPr>
+          <w:rFonts w:ascii="Arial" w:hAnsi="Arial" w:cs="Arial"/>
+          <w:i/>
+          <w:iCs/>
+          <w:sz w:val="22"/>
+          <w:szCs w:val="22"/>
+          <w:lang w:val="en-US"/>
+        </w:rPr>
+        <w:t>.”</w:t>
+      </w:r>
+    </w:p>
+    <w:p>
+      <w:pPr>
+        <w:rPr>
+          <w:rFonts w:ascii="Arial" w:hAnsi="Arial" w:cs="Arial"/>
+          <w:i/>
+          <w:iCs/>
+          <w:sz w:val="22"/>
+          <w:szCs w:val="22"/>
+          <w:lang w:val="en-US"/>
+        </w:rPr>
+      </w:pPr>
+    </w:p>
+    <w:p>
+      <w:pPr>
+        <w:rPr>
+          <w:rFonts w:ascii="Arial" w:hAnsi="Arial" w:cs="Arial"/>
+          <w:sz w:val="22"/>
+          <w:szCs w:val="22"/>
+          <w:lang w:val="en-US"/>
+        </w:rPr>
+      </w:pPr>
+      <w:r>
+        <w:rPr>
+          <w:rFonts w:ascii="Arial" w:hAnsi="Arial" w:cs="Arial"/>
+          <w:sz w:val="22"/>
+          <w:szCs w:val="22"/>
+          <w:lang w:val="en-US"/>
+        </w:rPr>
+        <w:t>No system prompt answer: "To fix a loose front brake, the solution depends on whether you have Cable-Actuated Brakes (Rim or Mechanical Disc) or Hydraulic Disc Brakes..." (goes on for a full step-by-step guide, ~400 words, with headers and a safety checklist).</w:t>
+      </w:r>
+    </w:p>
+    <w:p>
+      <w:pPr>
+        <w:rPr>
+          <w:rFonts w:ascii="Arial" w:hAnsi="Arial" w:cs="Arial"/>
+          <w:sz w:val="22"/>
+          <w:szCs w:val="22"/>
+          <w:lang w:val="en-US"/>
+        </w:rPr>
+      </w:pPr>
+      <w:r>
+        <w:rPr>
+          <w:rFonts w:ascii="Arial" w:hAnsi="Arial" w:cs="Arial"/>
+          <w:sz w:val="22"/>
+          <w:szCs w:val="22"/>
+          <w:lang w:val="en-US"/>
+        </w:rPr>
+        <w:t>With system prompt answer: "Check the brake cable tension and turn the barrel adjuster near the brake lever to tighten it, while also inspecting the brake pads for wear. If you are riding one of our rentals and the issue persists, please stop riding and visit the nearest station for a free adjustment or bike swap."</w:t>
+      </w:r>
+    </w:p>
+    <w:p>
+      <w:pPr>
+        <w:rPr>
+          <w:rFonts w:ascii="Arial" w:hAnsi="Arial" w:cs="Arial"/>
+          <w:i/>
+          <w:iCs/>
+          <w:sz w:val="22"/>
+          <w:szCs w:val="22"/>
+          <w:lang w:val="en-US"/>
+        </w:rPr>
+      </w:pPr>
+      <w:r>
+        <w:rPr>
+          <w:rFonts w:ascii="Arial" w:hAnsi="Arial" w:cs="Arial"/>
+          <w:sz w:val="22"/>
+          <w:szCs w:val="22"/>
+          <w:lang w:val="en-US"/>
+        </w:rPr>
+        <w:t>On this part I didn't change any code, just run it as is. I see how the answer without the system prompt goes really deep, explaining every brake type like a full mechanic guide, meanwhile with the system prompt the answer get short (2 sentences) and align to the bike-rental context, even adding a business action that wasn't there before ("stop riding and visit the nearest station"). So the system prompt is not just changing the tone, it's cutting the content and adding scope-specific behavior</w:t>
+      </w:r>
+      <w:r>
+        <w:rPr>
+          <w:rFonts w:ascii="Arial" w:hAnsi="Arial" w:cs="Arial"/>
+          <w:i/>
+          <w:iCs/>
+          <w:sz w:val="22"/>
+          <w:szCs w:val="22"/>
+          <w:lang w:val="en-US"/>
+        </w:rPr>
+        <w:t>.</w:t>
+      </w:r>
+    </w:p>
+    <w:p>
+      <w:pPr>
+        <w:rPr>
+          <w:rFonts w:ascii="Arial" w:hAnsi="Arial" w:cs="Arial"/>
+          <w:i/>
+          <w:iCs/>
+          <w:sz w:val="22"/>
+          <w:szCs w:val="22"/>
+          <w:lang w:val="en-US"/>
+        </w:rPr>
+      </w:pPr>
+    </w:p>
+    <w:p>
+      <w:pPr>
+        <w:rPr>
+          <w:rFonts w:ascii="Arial" w:hAnsi="Arial" w:cs="Arial"/>
+          <w:b/>
+          <w:bCs/>
+          <w:sz w:val="22"/>
+          <w:szCs w:val="22"/>
+          <w:lang w:val="en-US"/>
+        </w:rPr>
+      </w:pPr>
+      <w:r>
+        <w:rPr>
+          <w:rFonts w:ascii="Arial" w:hAnsi="Arial" w:cs="Arial"/>
+          <w:b/>
+          <w:bCs/>
+          <w:sz w:val="22"/>
+          <w:szCs w:val="22"/>
+          <w:lang w:val="en-US"/>
+        </w:rPr>
+        <w:lastRenderedPageBreak/>
+        <w:t>Zero-shot vs Few-shot</w:t>
+      </w:r>
+      <w:r>
+        <w:rPr>
+          <w:rFonts w:ascii="Arial" w:hAnsi="Arial" w:cs="Arial"/>
+          <w:sz w:val="22"/>
+          <w:szCs w:val="22"/>
+          <w:lang w:val="en-US"/>
+        </w:rPr>
+        <w:br/>
+      </w:r>
+      <w:r>
+        <w:rPr>
+          <w:rFonts w:ascii="Arial" w:hAnsi="Arial" w:cs="Arial"/>
+          <w:sz w:val="22"/>
+          <w:szCs w:val="22"/>
+          <w:lang w:val="en-US"/>
+        </w:rPr>
+        <w:drawing>
+          <wp:inline distT="0" distB="0" distL="0" distR="0" wp14:anchorId="7F306048" wp14:editId="28EF9392">
+            <wp:extent cx="5612130" cy="3517265"/>
+            <wp:effectExtent l="0" t="0" r="7620" b="6985"/>
+            <wp:docPr id="1514015899" name="Imagen 1"/>
+            <wp:cNvGraphicFramePr>
+              <a:graphicFrameLocks xmlns:a="http://schemas.openxmlformats.org/drawingml/2006/main" noChangeAspect="1"/>
+            </wp:cNvGraphicFramePr>
+            <a:graphic xmlns:a="http://schemas.openxmlformats.org/drawingml/2006/main">
+              <a:graphicData uri="http://schemas.openxmlformats.org/drawingml/2006/picture">
+                <pic:pic xmlns:pic="http://schemas.openxmlformats.org/drawingml/2006/picture">
+                  <pic:nvPicPr>
+                    <pic:cNvPr id="1514015899" name=""/>
+                    <pic:cNvPicPr/>
+                  </pic:nvPicPr>
+                  <pic:blipFill>
+                    <a:blip r:embed="rId8"/>
+                    <a:stretch>
+                      <a:fillRect/>
+                    </a:stretch>
+                  </pic:blipFill>
+                  <pic:spPr>
+                    <a:xfrm>
+                      <a:off x="0" y="0"/>
+                      <a:ext cx="5612130" cy="3517265"/>
+                    </a:xfrm>
+                    <a:prstGeom prst="rect">
+                      <a:avLst/>
+                    </a:prstGeom>
+                  </pic:spPr>
+                </pic:pic>
+              </a:graphicData>
+            </a:graphic>
+          </wp:inline>
+        </w:drawing>
+      </w:r>
+    </w:p>
+    <w:p>
+      <w:pPr>
+        <w:rPr>
+          <w:rFonts w:ascii="Arial" w:hAnsi="Arial" w:cs="Arial"/>
+          <w:sz w:val="22"/>
+          <w:szCs w:val="22"/>
+          <w:lang w:val="en-US"/>
+        </w:rPr>
+      </w:pPr>
+      <w:r>
+        <w:rPr>
+          <w:rFonts w:ascii="Arial" w:hAnsi="Arial" w:cs="Arial"/>
+          <w:sz w:val="22"/>
+          <w:szCs w:val="22"/>
+          <w:lang w:val="en-US"/>
+        </w:rPr>
+        <w:t>On this part I also didn't change anything on the code, just run it as is. Both answers get the correct label (neutral), but the format is different: zero-shot come back with markdown bold and capitalized ("</w:t>
+      </w:r>
+      <w:r>
+        <w:rPr>
+          <w:rFonts w:ascii="Arial" w:hAnsi="Arial" w:cs="Arial"/>
+          <w:b/>
+          <w:bCs/>
+          <w:sz w:val="22"/>
+          <w:szCs w:val="22"/>
+          <w:lang w:val="en-US"/>
+        </w:rPr>
+        <w:t>**</w:t>
+      </w:r>
+      <w:r>
+        <w:rPr>
+          <w:rFonts w:ascii="Arial" w:hAnsi="Arial" w:cs="Arial"/>
+          <w:sz w:val="22"/>
+          <w:szCs w:val="22"/>
+          <w:lang w:val="en-US"/>
+        </w:rPr>
+        <w:t>Neutral</w:t>
+      </w:r>
+      <w:r>
+        <w:rPr>
+          <w:rFonts w:ascii="Arial" w:hAnsi="Arial" w:cs="Arial"/>
+          <w:b/>
+          <w:bCs/>
+          <w:sz w:val="22"/>
+          <w:szCs w:val="22"/>
+          <w:lang w:val="en-US"/>
+        </w:rPr>
+        <w:t>**</w:t>
+      </w:r>
+      <w:r>
+        <w:rPr>
+          <w:rFonts w:ascii="Arial" w:hAnsi="Arial" w:cs="Arial"/>
+          <w:sz w:val="22"/>
+          <w:szCs w:val="22"/>
+          <w:lang w:val="en-US"/>
+        </w:rPr>
+        <w:t xml:space="preserve">"), and few-shot come back plain lowercase ("neutral"), matching exactly the format of the examples I gave in the prompt (positive / negative). This </w:t>
+      </w:r>
+      <w:r>
+        <w:rPr>
+          <w:rFonts w:ascii="Arial" w:hAnsi="Arial" w:cs="Arial"/>
+          <w:sz w:val="22"/>
+          <w:szCs w:val="22"/>
+          <w:lang w:val="en-US"/>
+        </w:rPr>
+        <w:t>shows</w:t>
+      </w:r>
+      <w:r>
+        <w:rPr>
+          <w:rFonts w:ascii="Arial" w:hAnsi="Arial" w:cs="Arial"/>
+          <w:sz w:val="22"/>
+          <w:szCs w:val="22"/>
+          <w:lang w:val="en-US"/>
+        </w:rPr>
+        <w:t xml:space="preserve"> that few-shot is not just about getting the right answer, it's about locking the output format so I can parse it later without extra cleanup.</w:t>
+      </w:r>
+    </w:p>
+    <w:p>
+      <w:pPr>
+        <w:rPr>
+          <w:rFonts w:ascii="Arial" w:hAnsi="Arial" w:cs="Arial"/>
+          <w:sz w:val="22"/>
+          <w:szCs w:val="22"/>
+          <w:lang w:val="en-US"/>
+        </w:rPr>
+      </w:pPr>
+      <w:r>
+        <w:rPr>
+          <w:rFonts w:ascii="Arial" w:hAnsi="Arial" w:cs="Arial"/>
+          <w:b/>
+          <w:bCs/>
+          <w:sz w:val="22"/>
+          <w:szCs w:val="22"/>
+          <w:lang w:val="en-US"/>
+        </w:rPr>
+        <w:t>Chain-of-thought vs. direct answer</w:t>
+      </w:r>
+    </w:p>
+    <w:p>
+      <w:pPr>
+        <w:rPr>
+          <w:rFonts w:ascii="Arial" w:hAnsi="Arial" w:cs="Arial"/>
+          <w:sz w:val="22"/>
+          <w:szCs w:val="22"/>
+          <w:lang w:val="en-US"/>
+        </w:rPr>
+      </w:pPr>
+      <w:r>
+        <w:rPr>
+          <w:rFonts w:ascii="Arial" w:hAnsi="Arial" w:cs="Arial"/>
+          <w:sz w:val="22"/>
+          <w:szCs w:val="22"/>
+          <w:lang w:val="en-US"/>
+        </w:rPr>
+        <w:lastRenderedPageBreak/>
+        <w:drawing>
+          <wp:inline distT="0" distB="0" distL="0" distR="0" wp14:anchorId="19D79CA5" wp14:editId="4B963130">
+            <wp:extent cx="5612130" cy="4411980"/>
+            <wp:effectExtent l="0" t="0" r="7620" b="7620"/>
+            <wp:docPr id="2095088819" name="Imagen 1"/>
+            <wp:cNvGraphicFramePr>
+              <a:graphicFrameLocks xmlns:a="http://schemas.openxmlformats.org/drawingml/2006/main" noChangeAspect="1"/>
+            </wp:cNvGraphicFramePr>
+            <a:graphic xmlns:a="http://schemas.openxmlformats.org/drawingml/2006/main">
+              <a:graphicData uri="http://schemas.openxmlformats.org/drawingml/2006/picture">
+                <pic:pic xmlns:pic="http://schemas.openxmlformats.org/drawingml/2006/picture">
+                  <pic:nvPicPr>
+                    <pic:cNvPr id="2095088819" name=""/>
+                    <pic:cNvPicPr/>
+                  </pic:nvPicPr>
+                  <pic:blipFill>
+                    <a:blip r:embed="rId9"/>
+                    <a:stretch>
+                      <a:fillRect/>
+                    </a:stretch>
+                  </pic:blipFill>
+                  <pic:spPr>
+                    <a:xfrm>
+                      <a:off x="0" y="0"/>
+                      <a:ext cx="5612130" cy="4411980"/>
+                    </a:xfrm>
+                    <a:prstGeom prst="rect">
+                      <a:avLst/>
+                    </a:prstGeom>
+                  </pic:spPr>
+                </pic:pic>
+              </a:graphicData>
+            </a:graphic>
+          </wp:inline>
+        </w:drawing>
+      </w:r>
+    </w:p>
+    <w:p>
+      <w:pPr>
+        <w:rPr>
+          <w:rFonts w:ascii="Arial" w:hAnsi="Arial" w:cs="Arial"/>
+          <w:sz w:val="22"/>
+          <w:szCs w:val="22"/>
+          <w:lang w:val="en-US"/>
+        </w:rPr>
+      </w:pPr>
+      <w:r>
+        <w:rPr>
+          <w:rFonts w:ascii="Arial" w:hAnsi="Arial" w:cs="Arial"/>
+          <w:sz w:val="22"/>
+          <w:szCs w:val="22"/>
+          <w:lang w:val="en-US"/>
+        </w:rPr>
+        <w:t>Chain-of-thought: "35% of 120 = 42 apples sold in the morning. 42 + 28 = 70 apples sold total. 120 - 70 = 50 apples left. Answer: 50"</w:t>
+      </w:r>
+    </w:p>
+    <w:p>
+      <w:pPr>
+        <w:rPr>
+          <w:rFonts w:ascii="Arial" w:hAnsi="Arial" w:cs="Arial"/>
+          <w:sz w:val="22"/>
+          <w:szCs w:val="22"/>
+          <w:lang w:val="en-US"/>
+        </w:rPr>
+      </w:pPr>
+      <w:r>
+        <w:rPr>
+          <w:rFonts w:ascii="Arial" w:hAnsi="Arial" w:cs="Arial"/>
+          <w:sz w:val="22"/>
+          <w:szCs w:val="22"/>
+          <w:lang w:val="en-US"/>
+        </w:rPr>
+        <w:t xml:space="preserve">On this part both answers land on the same correct result (50), so this time the difference is not the accuracy, it's the explainability. The direct answer just give me the number with no way to check how it get there, meanwhile the chain-of-thought answer show every step of the math (35% calculation, sum of both sales, subtraction from the total), so I can actually verify the reasoning instead of trusting a single token. A direct answer could be right by </w:t>
+      </w:r>
+      <w:r>
+        <w:rPr>
+          <w:rFonts w:ascii="Arial" w:hAnsi="Arial" w:cs="Arial"/>
+          <w:sz w:val="22"/>
+          <w:szCs w:val="22"/>
+          <w:lang w:val="en-US"/>
+        </w:rPr>
+        <w:t>luck,</w:t>
+      </w:r>
+      <w:r>
+        <w:rPr>
+          <w:rFonts w:ascii="Arial" w:hAnsi="Arial" w:cs="Arial"/>
+          <w:sz w:val="22"/>
+          <w:szCs w:val="22"/>
+          <w:lang w:val="en-US"/>
+        </w:rPr>
+        <w:t xml:space="preserve"> and I would never know it — with </w:t>
+      </w:r>
+      <w:proofErr w:type="spellStart"/>
+      <w:r>
+        <w:rPr>
+          <w:rFonts w:ascii="Arial" w:hAnsi="Arial" w:cs="Arial"/>
+          <w:sz w:val="22"/>
+          <w:szCs w:val="22"/>
+          <w:lang w:val="en-US"/>
+        </w:rPr>
+        <w:t>CoT</w:t>
+      </w:r>
+      <w:proofErr w:type="spellEnd"/>
+      <w:r>
+        <w:rPr>
+          <w:rFonts w:ascii="Arial" w:hAnsi="Arial" w:cs="Arial"/>
+          <w:sz w:val="22"/>
+          <w:szCs w:val="22"/>
+          <w:lang w:val="en-US"/>
+        </w:rPr>
+        <w:t xml:space="preserve"> I can catch it if a step is wrong.</w:t>
+      </w:r>
+    </w:p>
+    <w:p>
+      <w:pPr>
+        <w:rPr>
           <w:rFonts w:ascii="Arial" w:hAnsi="Arial" w:cs="Arial"/>
           <w:sz w:val="22"/>
           <w:szCs w:val="22"/>
@@ -536,8 +2388,137 @@
           <w:szCs w:val="24"/>
           <w:lang w:val="en-US"/>
         </w:rPr>
+        <w:t>Activity 3</w:t>
+      </w:r>
+    </w:p>
+    <w:p>
+      <w:pPr>
+        <w:rPr>
+          <w:lang w:val="en-US"/>
+        </w:rPr>
+      </w:pPr>
+      <w:r>
+        <w:rPr>
+          <w:lang w:val="en-US"/>
+        </w:rPr>
+        <w:t xml:space="preserve">At this point I ask to a </w:t>
+      </w:r>
+      <w:proofErr w:type="spellStart"/>
+      <w:r>
+        <w:rPr>
+          <w:lang w:val="en-US"/>
+        </w:rPr>
+        <w:t>angent</w:t>
+      </w:r>
+      <w:proofErr w:type="spellEnd"/>
+      <w:r>
+        <w:rPr>
+          <w:lang w:val="en-US"/>
+        </w:rPr>
+        <w:t xml:space="preserve"> to generate the vague prompt for a real-word task also, I just passed on a different LLM with different responses like in the below image</w:t>
+      </w:r>
+    </w:p>
+    <w:p>
+      <w:pPr>
+        <w:rPr>
+          <w:rFonts w:ascii="Arial" w:hAnsi="Arial" w:cs="Arial"/>
+          <w:lang w:val="en-US"/>
+        </w:rPr>
+      </w:pPr>
+      <w:r>
+        <w:rPr>
+          <w:rFonts w:ascii="Arial" w:hAnsi="Arial" w:cs="Arial"/>
+          <w:lang w:val="en-US"/>
+        </w:rPr>
         <w:lastRenderedPageBreak/>
-        <w:t>Activity 3</w:t>
+        <w:drawing>
+          <wp:inline distT="0" distB="0" distL="0" distR="0" wp14:anchorId="5B7690B3" wp14:editId="022E64A4">
+            <wp:extent cx="5612130" cy="5554345"/>
+            <wp:effectExtent l="0" t="0" r="7620" b="8255"/>
+            <wp:docPr id="1496936279" name="Imagen 1"/>
+            <wp:cNvGraphicFramePr>
+              <a:graphicFrameLocks xmlns:a="http://schemas.openxmlformats.org/drawingml/2006/main" noChangeAspect="1"/>
+            </wp:cNvGraphicFramePr>
+            <a:graphic xmlns:a="http://schemas.openxmlformats.org/drawingml/2006/main">
+              <a:graphicData uri="http://schemas.openxmlformats.org/drawingml/2006/picture">
+                <pic:pic xmlns:pic="http://schemas.openxmlformats.org/drawingml/2006/picture">
+                  <pic:nvPicPr>
+                    <pic:cNvPr id="1496936279" name=""/>
+                    <pic:cNvPicPr/>
+                  </pic:nvPicPr>
+                  <pic:blipFill>
+                    <a:blip r:embed="rId10"/>
+                    <a:stretch>
+                      <a:fillRect/>
+                    </a:stretch>
+                  </pic:blipFill>
+                  <pic:spPr>
+                    <a:xfrm>
+                      <a:off x="0" y="0"/>
+                      <a:ext cx="5612130" cy="5554345"/>
+                    </a:xfrm>
+                    <a:prstGeom prst="rect">
+                      <a:avLst/>
+                    </a:prstGeom>
+                  </pic:spPr>
+                </pic:pic>
+              </a:graphicData>
+            </a:graphic>
+          </wp:inline>
+        </w:drawing>
+      </w:r>
+    </w:p>
+    <w:p>
+      <w:pPr>
+        <w:rPr>
+          <w:rFonts w:ascii="Arial" w:hAnsi="Arial" w:cs="Arial"/>
+          <w:lang w:val="en-US"/>
+        </w:rPr>
+      </w:pPr>
+      <w:r>
+        <w:rPr>
+          <w:rFonts w:ascii="Arial" w:hAnsi="Arial" w:cs="Arial"/>
+          <w:lang w:val="en-US"/>
+        </w:rPr>
+        <w:t>Contract A (lease) came back as 7 bullets: Parties, Property, Lease Term, Rent, Security Deposit, Utilities, Early Termination.</w:t>
+      </w:r>
+    </w:p>
+    <w:p>
+      <w:pPr>
+        <w:rPr>
+          <w:rFonts w:ascii="Arial" w:hAnsi="Arial" w:cs="Arial"/>
+          <w:lang w:val="en-US"/>
+        </w:rPr>
+      </w:pPr>
+      <w:r>
+        <w:rPr>
+          <w:rFonts w:ascii="Arial" w:hAnsi="Arial" w:cs="Arial"/>
+          <w:lang w:val="en-US"/>
+        </w:rPr>
+        <w:t>Contract B (NDA) came back as 6 bullets, but with different headers: Parties Involved, Protected Information, Obligations, Duration, Remedies for Breach, Governing Law.</w:t>
+      </w:r>
+    </w:p>
+    <w:p>
+      <w:pPr>
+        <w:rPr>
+          <w:rFonts w:ascii="Arial" w:hAnsi="Arial" w:cs="Arial"/>
+          <w:lang w:val="en-US"/>
+        </w:rPr>
+      </w:pPr>
+      <w:r>
+        <w:rPr>
+          <w:rFonts w:ascii="Arial" w:hAnsi="Arial" w:cs="Arial"/>
+          <w:lang w:val="en-US"/>
+        </w:rPr>
+        <w:t xml:space="preserve">the weak prompt has no role, no output structure, and no examples. It happens to produce readable bullets both times (the model defaults to some structure on its own), but the headers and bullet count are different for every document — there's no fixed schema, so I can't reliably parse "the obligations section" or "the risk section" out of the response, and no way to guarantee the summary calls out risk at all (Contract A doesn't mention any risk framing, Contract B does through </w:t>
+      </w:r>
+      <w:r>
+        <w:rPr>
+          <w:rFonts w:ascii="Arial" w:hAnsi="Arial" w:cs="Arial"/>
+          <w:lang w:val="en-US"/>
+        </w:rPr>
+        <w:lastRenderedPageBreak/>
+        <w:t>"Remedies for Breach"). This is the actual problem the group workshop is about: missing role + missing output structure = inconsistent shape, even when the content itself is fine.</w:t>
       </w:r>
     </w:p>
     <w:p>
@@ -577,10 +2558,517 @@
     <w:p>
       <w:pPr>
         <w:rPr>
-          <w:rFonts w:ascii="Arial" w:hAnsi="Arial" w:cs="Arial"/>
-          <w:lang w:val="en-US"/>
-        </w:rPr>
-      </w:pPr>
+          <w:lang w:val="es-419"/>
+        </w:rPr>
+      </w:pPr>
+      <w:r>
+        <w:rPr>
+          <w:lang w:val="es-419"/>
+        </w:rPr>
+        <w:drawing>
+          <wp:inline distT="0" distB="0" distL="0" distR="0" wp14:anchorId="1CF5D1D4" wp14:editId="7E88473D">
+            <wp:extent cx="5612130" cy="3540760"/>
+            <wp:effectExtent l="0" t="0" r="7620" b="2540"/>
+            <wp:docPr id="472597493" name="Imagen 1"/>
+            <wp:cNvGraphicFramePr>
+              <a:graphicFrameLocks xmlns:a="http://schemas.openxmlformats.org/drawingml/2006/main" noChangeAspect="1"/>
+            </wp:cNvGraphicFramePr>
+            <a:graphic xmlns:a="http://schemas.openxmlformats.org/drawingml/2006/main">
+              <a:graphicData uri="http://schemas.openxmlformats.org/drawingml/2006/picture">
+                <pic:pic xmlns:pic="http://schemas.openxmlformats.org/drawingml/2006/picture">
+                  <pic:nvPicPr>
+                    <pic:cNvPr id="472597493" name=""/>
+                    <pic:cNvPicPr/>
+                  </pic:nvPicPr>
+                  <pic:blipFill>
+                    <a:blip r:embed="rId11"/>
+                    <a:stretch>
+                      <a:fillRect/>
+                    </a:stretch>
+                  </pic:blipFill>
+                  <pic:spPr>
+                    <a:xfrm>
+                      <a:off x="0" y="0"/>
+                      <a:ext cx="5612130" cy="3540760"/>
+                    </a:xfrm>
+                    <a:prstGeom prst="rect">
+                      <a:avLst/>
+                    </a:prstGeom>
+                  </pic:spPr>
+                </pic:pic>
+              </a:graphicData>
+            </a:graphic>
+          </wp:inline>
+        </w:drawing>
+      </w:r>
+    </w:p>
+    <w:p>
+      <w:pPr>
+        <w:rPr>
+          <w:lang w:val="en-US"/>
+        </w:rPr>
+      </w:pPr>
+      <w:proofErr w:type="spellStart"/>
+      <w:r>
+        <w:rPr>
+          <w:lang w:val="en-US"/>
+        </w:rPr>
+        <w:t>response.parsed</w:t>
+      </w:r>
+      <w:proofErr w:type="spellEnd"/>
+      <w:r>
+        <w:rPr>
+          <w:lang w:val="en-US"/>
+        </w:rPr>
+        <w:t xml:space="preserve"> already come back as a real </w:t>
+      </w:r>
+      <w:proofErr w:type="spellStart"/>
+      <w:r>
+        <w:rPr>
+          <w:lang w:val="en-US"/>
+        </w:rPr>
+        <w:t>TicketTriage</w:t>
+      </w:r>
+      <w:proofErr w:type="spellEnd"/>
+      <w:r>
+        <w:rPr>
+          <w:lang w:val="en-US"/>
+        </w:rPr>
+        <w:t xml:space="preserve"> instance, not a string I need to `</w:t>
+      </w:r>
+      <w:proofErr w:type="spellStart"/>
+      <w:r>
+        <w:rPr>
+          <w:lang w:val="en-US"/>
+        </w:rPr>
+        <w:t>json.loads</w:t>
+      </w:r>
+      <w:proofErr w:type="spellEnd"/>
+      <w:r>
+        <w:rPr>
+          <w:lang w:val="en-US"/>
+        </w:rPr>
+        <w:t>()</w:t>
+      </w:r>
+      <w:r>
+        <w:rPr>
+          <w:lang w:val="en-US"/>
+        </w:rPr>
+        <w:t xml:space="preserve"> </w:t>
+      </w:r>
+      <w:r>
+        <w:rPr>
+          <w:lang w:val="en-US"/>
+        </w:rPr>
+        <w:t xml:space="preserve">myself. No parsing errors, </w:t>
+      </w:r>
+      <w:proofErr w:type="spellStart"/>
+      <w:r>
+        <w:rPr>
+          <w:lang w:val="en-US"/>
+        </w:rPr>
+        <w:t>categoryand</w:t>
+      </w:r>
+      <w:proofErr w:type="spellEnd"/>
+      <w:r>
+        <w:rPr>
+          <w:lang w:val="en-US"/>
+        </w:rPr>
+        <w:t xml:space="preserve"> </w:t>
+      </w:r>
+      <w:proofErr w:type="spellStart"/>
+      <w:r>
+        <w:rPr>
+          <w:lang w:val="en-US"/>
+        </w:rPr>
+        <w:t>urgencyland</w:t>
+      </w:r>
+      <w:proofErr w:type="spellEnd"/>
+      <w:r>
+        <w:rPr>
+          <w:lang w:val="en-US"/>
+        </w:rPr>
+        <w:t xml:space="preserve"> exactly on values that make sense ("Billing" / "High") given the schema comments as hints. This is the fix for the "unconstrained free-text output breaks the JSON pipeline" problem the instructor showed live </w:t>
+      </w:r>
+      <w:proofErr w:type="spellStart"/>
+      <w:r>
+        <w:rPr>
+          <w:lang w:val="en-US"/>
+        </w:rPr>
+        <w:t>response_schema</w:t>
+      </w:r>
+      <w:proofErr w:type="spellEnd"/>
+      <w:r>
+        <w:rPr>
+          <w:lang w:val="en-US"/>
+        </w:rPr>
+        <w:t>=</w:t>
+      </w:r>
+      <w:proofErr w:type="spellStart"/>
+      <w:r>
+        <w:rPr>
+          <w:lang w:val="en-US"/>
+        </w:rPr>
+        <w:t>TicketTriageforces</w:t>
+      </w:r>
+      <w:proofErr w:type="spellEnd"/>
+      <w:r>
+        <w:rPr>
+          <w:lang w:val="en-US"/>
+        </w:rPr>
+        <w:t xml:space="preserve"> the shape instead of hoping the model wraps things in </w:t>
+      </w:r>
+      <w:proofErr w:type="spellStart"/>
+      <w:r>
+        <w:rPr>
+          <w:lang w:val="en-US"/>
+        </w:rPr>
+        <w:t>json</w:t>
+      </w:r>
+      <w:proofErr w:type="spellEnd"/>
+      <w:r>
+        <w:rPr>
+          <w:lang w:val="en-US"/>
+        </w:rPr>
+        <w:t xml:space="preserve"> fences correctly.</w:t>
+      </w:r>
+    </w:p>
+    <w:p>
+      <w:pPr>
+        <w:rPr>
+          <w:lang w:val="en-US"/>
+        </w:rPr>
+      </w:pPr>
+      <w:r>
+        <w:rPr>
+          <w:lang w:val="en-US"/>
+        </w:rPr>
+        <w:lastRenderedPageBreak/>
+        <w:drawing>
+          <wp:inline distT="0" distB="0" distL="0" distR="0" wp14:anchorId="77E12FA5" wp14:editId="16C9BDFC">
+            <wp:extent cx="5612130" cy="5471160"/>
+            <wp:effectExtent l="0" t="0" r="7620" b="0"/>
+            <wp:docPr id="1979686395" name="Imagen 1"/>
+            <wp:cNvGraphicFramePr>
+              <a:graphicFrameLocks xmlns:a="http://schemas.openxmlformats.org/drawingml/2006/main" noChangeAspect="1"/>
+            </wp:cNvGraphicFramePr>
+            <a:graphic xmlns:a="http://schemas.openxmlformats.org/drawingml/2006/main">
+              <a:graphicData uri="http://schemas.openxmlformats.org/drawingml/2006/picture">
+                <pic:pic xmlns:pic="http://schemas.openxmlformats.org/drawingml/2006/picture">
+                  <pic:nvPicPr>
+                    <pic:cNvPr id="1979686395" name=""/>
+                    <pic:cNvPicPr/>
+                  </pic:nvPicPr>
+                  <pic:blipFill>
+                    <a:blip r:embed="rId12"/>
+                    <a:stretch>
+                      <a:fillRect/>
+                    </a:stretch>
+                  </pic:blipFill>
+                  <pic:spPr>
+                    <a:xfrm>
+                      <a:off x="0" y="0"/>
+                      <a:ext cx="5612130" cy="5471160"/>
+                    </a:xfrm>
+                    <a:prstGeom prst="rect">
+                      <a:avLst/>
+                    </a:prstGeom>
+                  </pic:spPr>
+                </pic:pic>
+              </a:graphicData>
+            </a:graphic>
+          </wp:inline>
+        </w:drawing>
+      </w:r>
+    </w:p>
+    <w:p>
+      <w:pPr>
+        <w:rPr>
+          <w:rFonts w:ascii="Arial" w:hAnsi="Arial" w:cs="Arial"/>
+          <w:lang w:val="en-US"/>
+        </w:rPr>
+      </w:pPr>
+      <w:r>
+        <w:rPr>
+          <w:rFonts w:ascii="Arial" w:hAnsi="Arial" w:cs="Arial"/>
+          <w:lang w:val="en-US"/>
+        </w:rPr>
+        <w:t xml:space="preserve">Same category/urgency as the raw SDK call in 4a, just a slightly reworded summary. The difference here is the ADK </w:t>
+      </w:r>
+      <w:proofErr w:type="spellStart"/>
+      <w:r>
+        <w:rPr>
+          <w:rFonts w:ascii="Arial" w:hAnsi="Arial" w:cs="Arial"/>
+          <w:lang w:val="en-US"/>
+        </w:rPr>
+        <w:t>LlmAgent</w:t>
+      </w:r>
+      <w:proofErr w:type="spellEnd"/>
+      <w:r>
+        <w:rPr>
+          <w:rFonts w:ascii="Arial" w:hAnsi="Arial" w:cs="Arial"/>
+          <w:lang w:val="en-US"/>
+        </w:rPr>
+        <w:t xml:space="preserve"> still hands back a plain JSON string through the event stream (I had to </w:t>
+      </w:r>
+      <w:proofErr w:type="spellStart"/>
+      <w:r>
+        <w:rPr>
+          <w:rFonts w:ascii="Arial" w:hAnsi="Arial" w:cs="Arial"/>
+          <w:lang w:val="en-US"/>
+        </w:rPr>
+        <w:t>model_validate_json</w:t>
+      </w:r>
+      <w:proofErr w:type="spellEnd"/>
+      <w:r>
+        <w:rPr>
+          <w:rFonts w:ascii="Arial" w:hAnsi="Arial" w:cs="Arial"/>
+          <w:lang w:val="en-US"/>
+        </w:rPr>
+        <w:t xml:space="preserve"> it myself), while the raw SDK's </w:t>
+      </w:r>
+      <w:proofErr w:type="spellStart"/>
+      <w:r>
+        <w:rPr>
+          <w:rFonts w:ascii="Arial" w:hAnsi="Arial" w:cs="Arial"/>
+          <w:lang w:val="en-US"/>
+        </w:rPr>
+        <w:t>response.parsed</w:t>
+      </w:r>
+      <w:proofErr w:type="spellEnd"/>
+      <w:r>
+        <w:rPr>
+          <w:rFonts w:ascii="Arial" w:hAnsi="Arial" w:cs="Arial"/>
+          <w:lang w:val="en-US"/>
+        </w:rPr>
+        <w:t xml:space="preserve"> in 4a did that step automatically. So </w:t>
+      </w:r>
+      <w:proofErr w:type="spellStart"/>
+      <w:r>
+        <w:rPr>
+          <w:rFonts w:ascii="Arial" w:hAnsi="Arial" w:cs="Arial"/>
+          <w:lang w:val="en-US"/>
+        </w:rPr>
+        <w:t>output_schema</w:t>
+      </w:r>
+      <w:proofErr w:type="spellEnd"/>
+      <w:r>
+        <w:rPr>
+          <w:rFonts w:ascii="Arial" w:hAnsi="Arial" w:cs="Arial"/>
+          <w:lang w:val="en-US"/>
+        </w:rPr>
+        <w:t xml:space="preserve"> on ADK guarantees the JSON is well-formed, but the raw SDK path is one step shorter to a typed object.</w:t>
+      </w:r>
+    </w:p>
+    <w:p>
+      <w:pPr>
+        <w:rPr>
+          <w:rFonts w:ascii="Arial" w:hAnsi="Arial" w:cs="Arial"/>
+          <w:lang w:val="en-US"/>
+        </w:rPr>
+      </w:pPr>
+      <w:r>
+        <w:rPr>
+          <w:rFonts w:ascii="Arial" w:hAnsi="Arial" w:cs="Arial"/>
+          <w:lang w:val="en-US"/>
+        </w:rPr>
+        <w:lastRenderedPageBreak/>
+        <w:drawing>
+          <wp:inline distT="0" distB="0" distL="0" distR="0" wp14:anchorId="3F3BEC3C" wp14:editId="409BA4AA">
+            <wp:extent cx="5612130" cy="6689725"/>
+            <wp:effectExtent l="0" t="0" r="7620" b="0"/>
+            <wp:docPr id="272945749" name="Imagen 1"/>
+            <wp:cNvGraphicFramePr>
+              <a:graphicFrameLocks xmlns:a="http://schemas.openxmlformats.org/drawingml/2006/main" noChangeAspect="1"/>
+            </wp:cNvGraphicFramePr>
+            <a:graphic xmlns:a="http://schemas.openxmlformats.org/drawingml/2006/main">
+              <a:graphicData uri="http://schemas.openxmlformats.org/drawingml/2006/picture">
+                <pic:pic xmlns:pic="http://schemas.openxmlformats.org/drawingml/2006/picture">
+                  <pic:nvPicPr>
+                    <pic:cNvPr id="272945749" name=""/>
+                    <pic:cNvPicPr/>
+                  </pic:nvPicPr>
+                  <pic:blipFill>
+                    <a:blip r:embed="rId13"/>
+                    <a:stretch>
+                      <a:fillRect/>
+                    </a:stretch>
+                  </pic:blipFill>
+                  <pic:spPr>
+                    <a:xfrm>
+                      <a:off x="0" y="0"/>
+                      <a:ext cx="5612130" cy="6689725"/>
+                    </a:xfrm>
+                    <a:prstGeom prst="rect">
+                      <a:avLst/>
+                    </a:prstGeom>
+                  </pic:spPr>
+                </pic:pic>
+              </a:graphicData>
+            </a:graphic>
+          </wp:inline>
+        </w:drawing>
+      </w:r>
+    </w:p>
+    <w:p>
+      <w:pPr>
+        <w:rPr>
+          <w:rFonts w:ascii="Arial" w:hAnsi="Arial" w:cs="Arial"/>
+          <w:lang w:val="en-US"/>
+        </w:rPr>
+      </w:pPr>
+      <w:r>
+        <w:rPr>
+          <w:rFonts w:ascii="Arial" w:hAnsi="Arial" w:cs="Arial"/>
+          <w:lang w:val="en-US"/>
+        </w:rPr>
+        <w:t>All 6 labels are correct on both prompting styles, so like in section 2, accuracy isn't the story here, format is: zero-shot keeps wrapping the label in markdown bold and capitalizing it (`**Spam**`), few-shot locks it to the exact lowercase word shown in the 3 examples (`spam`). Same pattern holds even for a task I picked myself, not just the sentiment example from section 2</w:t>
+      </w:r>
+      <w:r>
+        <w:rPr>
+          <w:rFonts w:ascii="Arial" w:hAnsi="Arial" w:cs="Arial"/>
+          <w:lang w:val="en-US"/>
+        </w:rPr>
+        <w:t xml:space="preserve">, </w:t>
+      </w:r>
+      <w:r>
+        <w:rPr>
+          <w:rFonts w:ascii="Arial" w:hAnsi="Arial" w:cs="Arial"/>
+          <w:lang w:val="en-US"/>
+        </w:rPr>
+        <w:t>few-shot's main value is consistency of the output shape, not correctness.</w:t>
+      </w:r>
+    </w:p>
+    <w:p>
+      <w:pPr>
+        <w:rPr>
+          <w:rFonts w:ascii="Arial" w:hAnsi="Arial" w:cs="Arial"/>
+          <w:lang w:val="en-US"/>
+        </w:rPr>
+      </w:pPr>
+      <w:r>
+        <w:rPr>
+          <w:rFonts w:ascii="Arial" w:hAnsi="Arial" w:cs="Arial"/>
+          <w:lang w:val="en-US"/>
+        </w:rPr>
+        <w:lastRenderedPageBreak/>
+        <w:drawing>
+          <wp:inline distT="0" distB="0" distL="0" distR="0" wp14:anchorId="3370C534" wp14:editId="6A394CB3">
+            <wp:extent cx="5612130" cy="5415915"/>
+            <wp:effectExtent l="0" t="0" r="7620" b="0"/>
+            <wp:docPr id="175605368" name="Imagen 1"/>
+            <wp:cNvGraphicFramePr>
+              <a:graphicFrameLocks xmlns:a="http://schemas.openxmlformats.org/drawingml/2006/main" noChangeAspect="1"/>
+            </wp:cNvGraphicFramePr>
+            <a:graphic xmlns:a="http://schemas.openxmlformats.org/drawingml/2006/main">
+              <a:graphicData uri="http://schemas.openxmlformats.org/drawingml/2006/picture">
+                <pic:pic xmlns:pic="http://schemas.openxmlformats.org/drawingml/2006/picture">
+                  <pic:nvPicPr>
+                    <pic:cNvPr id="175605368" name=""/>
+                    <pic:cNvPicPr/>
+                  </pic:nvPicPr>
+                  <pic:blipFill>
+                    <a:blip r:embed="rId14"/>
+                    <a:stretch>
+                      <a:fillRect/>
+                    </a:stretch>
+                  </pic:blipFill>
+                  <pic:spPr>
+                    <a:xfrm>
+                      <a:off x="0" y="0"/>
+                      <a:ext cx="5612130" cy="5415915"/>
+                    </a:xfrm>
+                    <a:prstGeom prst="rect">
+                      <a:avLst/>
+                    </a:prstGeom>
+                  </pic:spPr>
+                </pic:pic>
+              </a:graphicData>
+            </a:graphic>
+          </wp:inline>
+        </w:drawing>
+      </w:r>
+    </w:p>
+    <w:p>
+      <w:pPr>
+        <w:rPr>
+          <w:rFonts w:ascii="Arial" w:hAnsi="Arial" w:cs="Arial"/>
+          <w:lang w:val="en-US"/>
+        </w:rPr>
+      </w:pPr>
+      <w:r>
+        <w:rPr>
+          <w:rFonts w:ascii="Arial" w:hAnsi="Arial" w:cs="Arial"/>
+          <w:lang w:val="en-US"/>
+        </w:rPr>
+        <w:t xml:space="preserve">All 3 came back as valid </w:t>
+      </w:r>
+      <w:proofErr w:type="spellStart"/>
+      <w:r>
+        <w:rPr>
+          <w:rFonts w:ascii="Arial" w:hAnsi="Arial" w:cs="Arial"/>
+          <w:lang w:val="en-US"/>
+        </w:rPr>
+        <w:t>ResumeLine</w:t>
+      </w:r>
+      <w:proofErr w:type="spellEnd"/>
+      <w:r>
+        <w:rPr>
+          <w:rFonts w:ascii="Arial" w:hAnsi="Arial" w:cs="Arial"/>
+          <w:lang w:val="en-US"/>
+        </w:rPr>
+        <w:t xml:space="preserve"> instances with no parsing errors, even though the 3 inputs use different phrasing (comma-separated vs. "at ... for ..." vs. "worked as"). The one that surprised me is the last one: I wrote "six months" in plain English and the model converted it to years=0.5 on its own — the years: float type hint alone was enough to make it do the unit conversion instead of just failing or returning a string.</w:t>
+      </w:r>
+    </w:p>
+    <w:p>
+      <w:pPr>
+        <w:rPr>
+          <w:rFonts w:ascii="Arial" w:hAnsi="Arial" w:cs="Arial"/>
+          <w:u w:val="single"/>
+          <w:lang w:val="en-US"/>
+        </w:rPr>
+      </w:pPr>
+      <w:proofErr w:type="spellStart"/>
+      <w:r>
+        <w:rPr>
+          <w:rFonts w:ascii="Arial" w:hAnsi="Arial" w:cs="Arial"/>
+          <w:lang w:val="en-US"/>
+        </w:rPr>
+        <w:t>Github</w:t>
+      </w:r>
+      <w:proofErr w:type="spellEnd"/>
+      <w:r>
+        <w:rPr>
+          <w:rFonts w:ascii="Arial" w:hAnsi="Arial" w:cs="Arial"/>
+          <w:lang w:val="en-US"/>
+        </w:rPr>
+        <w:t xml:space="preserve"> URL with all weeks solutions: </w:t>
+      </w:r>
+      <w:r>
+        <w:fldChar w:fldCharType="begin"/>
+      </w:r>
+      <w:r>
+        <w:rPr>
+          <w:lang w:val="en-US"/>
+        </w:rPr>
+        <w:instrText>HYPERLINK "https://github.com/JoseMartInez2611/ai_agentic_class"</w:instrText>
+      </w:r>
+      <w:r>
+        <w:fldChar w:fldCharType="separate"/>
+      </w:r>
+      <w:r>
+        <w:rPr>
+          <w:rStyle w:val="Hipervnculo"/>
+          <w:rFonts w:ascii="Arial" w:hAnsi="Arial" w:cs="Arial"/>
+          <w:sz w:val="22"/>
+          <w:szCs w:val="22"/>
+          <w:lang w:val="en-US"/>
+        </w:rPr>
+        <w:t>https://github.com/JoseMartInez2611/ai_agentic_class</w:t>
+      </w:r>
+      <w:r>
+        <w:fldChar w:fldCharType="end"/>
+      </w:r>
     </w:p>
     <w:p>
       <w:pPr>
@@ -638,6 +3126,7 @@
           <w:rFonts w:ascii="Arial" w:hAnsi="Arial" w:cs="Arial"/>
           <w:lang w:val="en-US"/>
         </w:rPr>
+        <w:lastRenderedPageBreak/>
         <w:t>Draft the </w:t>
       </w:r>
       <w:r>
@@ -771,15 +3260,13 @@
         </w:rPr>
         <w:t xml:space="preserve">Role: </w:t>
       </w:r>
-      <w:proofErr w:type="gramStart"/>
-      <w:r>
-        <w:rPr>
-          <w:rFonts w:ascii="Arial" w:hAnsi="Arial" w:cs="Arial"/>
-          <w:lang w:val="en-US"/>
-        </w:rPr>
-        <w:t>Integral calculus tutor,</w:t>
-      </w:r>
-      <w:proofErr w:type="gramEnd"/>
+      <w:r>
+        <w:rPr>
+          <w:rFonts w:ascii="Arial" w:hAnsi="Arial" w:cs="Arial"/>
+          <w:lang w:val="en-US"/>
+        </w:rPr>
+        <w:t>Integral calculus tutor</w:t>
+      </w:r>
       <w:r>
         <w:rPr>
           <w:rFonts w:ascii="Arial" w:hAnsi="Arial" w:cs="Arial"/>
@@ -837,15 +3324,20 @@
         </w:rPr>
         <w:t xml:space="preserve">Refusal: Rejects non-calculus topics, standalone questions on derivatives/limits, and requests for "just give me the answer without </w:t>
       </w:r>
-      <w:proofErr w:type="gramStart"/>
-      <w:r>
-        <w:rPr>
-          <w:rFonts w:ascii="Arial" w:hAnsi="Arial" w:cs="Arial"/>
-          <w:lang w:val="en-US"/>
-        </w:rPr>
-        <w:t>explanation"—</w:t>
-      </w:r>
-      <w:proofErr w:type="gramEnd"/>
+      <w:r>
+        <w:rPr>
+          <w:rFonts w:ascii="Arial" w:hAnsi="Arial" w:cs="Arial"/>
+          <w:lang w:val="en-US"/>
+        </w:rPr>
+        <w:t>explanation”</w:t>
+      </w:r>
+      <w:r>
+        <w:rPr>
+          <w:rFonts w:ascii="Arial" w:hAnsi="Arial" w:cs="Arial"/>
+          <w:lang w:val="en-US"/>
+        </w:rPr>
+        <w:t xml:space="preserve"> </w:t>
+      </w:r>
       <w:r>
         <w:rPr>
           <w:rFonts w:ascii="Arial" w:hAnsi="Arial" w:cs="Arial"/>
@@ -904,15 +3396,13 @@
         </w:rPr>
         <w:t>Decide whether any part of its output needs to be structured (</w:t>
       </w:r>
-      <w:proofErr w:type="gramStart"/>
-      <w:r>
-        <w:rPr>
-          <w:rFonts w:ascii="Arial" w:hAnsi="Arial" w:cs="Arial"/>
-          <w:lang w:val="en-US"/>
-        </w:rPr>
-        <w:t>JSON) —</w:t>
-      </w:r>
-      <w:proofErr w:type="gramEnd"/>
+      <w:r>
+        <w:rPr>
+          <w:rFonts w:ascii="Arial" w:hAnsi="Arial" w:cs="Arial"/>
+          <w:lang w:val="en-US"/>
+        </w:rPr>
+        <w:t>JSON)</w:t>
+      </w:r>
       <w:r>
         <w:rPr>
           <w:rFonts w:ascii="Arial" w:hAnsi="Arial" w:cs="Arial"/>
@@ -969,15 +3459,7 @@
           <w:rFonts w:ascii="Arial" w:hAnsi="Arial" w:cs="Arial"/>
           <w:lang w:val="en-US"/>
         </w:rPr>
-        <w:t xml:space="preserve">prompts/system_prompt.txt created and committed. PROPOSAL.md updated with "Example Questions" section 3 example questions </w:t>
-      </w:r>
-      <w:r>
-        <w:rPr>
-          <w:rFonts w:ascii="Arial" w:hAnsi="Arial" w:cs="Arial"/>
-          <w:lang w:val="en-US"/>
-        </w:rPr>
-        <w:lastRenderedPageBreak/>
-        <w:t xml:space="preserve">(integral of </w:t>
+        <w:t xml:space="preserve">prompts/system_prompt.txt created and committed. PROPOSAL.md updated with "Example Questions" section 3 example questions (integral of </w:t>
       </w:r>
       <w:proofErr w:type="spellStart"/>
       <w:r>
@@ -995,7 +3477,7 @@
         </w:rPr>
         <w:t xml:space="preserve">, area under sin(x) from 0 to π, why +C). Push to week2-advancement branch, pull request open to main: </w:t>
       </w:r>
-      <w:hyperlink r:id="rId7" w:history="1">
+      <w:hyperlink r:id="rId15" w:history="1">
         <w:r>
           <w:rPr>
             <w:rStyle w:val="Hipervnculo"/>

</xml_diff>